<commit_message>
Hosting gratuito: SQLite forzable, claves de sesión persistentes y despliegue en Oracle Cloud (Docker + Caddy)
Co-Authored-By: Claude Sonnet 5.5 <noreply@anthropic.com>
</commit_message>
<xml_diff>
--- a/docs/Saborator-02-Manual-de-Usuario.docx
+++ b/docs/Saborator-02-Manual-de-Usuario.docx
@@ -4672,57 +4672,6 @@
     </w:p>
     <w:p>
       <w:pPr>
-        <w:pStyle w:val="Heading3"/>
-        <w:keepNext/>
-        <w:spacing w:after="120" w:before="280"/>
-        <w:jc w:val="left"/>
-      </w:pPr>
-      <w:r>
-        <w:rPr>
-          <w:rFonts w:ascii="Arial" w:cs="Arial" w:eastAsia="Arial" w:hAnsi="Arial"/>
-          <w:b/>
-          <w:bCs/>
-          <w:color w:val="3A2B32"/>
-          <w:sz w:val="26"/>
-          <w:szCs w:val="26"/>
-        </w:rPr>
-        <w:t xml:space="preserve">5.2 Recetario</w:t>
-      </w:r>
-    </w:p>
-    <w:p>
-      <w:pPr>
-        <w:spacing w:after="120" w:line="300"/>
-        <w:jc w:val="left"/>
-      </w:pPr>
-      <w:r>
-        <w:rPr>
-          <w:rFonts w:ascii="Arial" w:cs="Arial" w:eastAsia="Arial" w:hAnsi="Arial"/>
-          <w:sz w:val="22"/>
-          <w:szCs w:val="22"/>
-        </w:rPr>
-        <w:t xml:space="preserve">La opción </w:t>
-      </w:r>
-      <w:r>
-        <w:rPr>
-          <w:rFonts w:ascii="Arial" w:cs="Arial" w:eastAsia="Arial" w:hAnsi="Arial"/>
-          <w:b/>
-          <w:bCs/>
-          <w:sz w:val="22"/>
-          <w:szCs w:val="22"/>
-        </w:rPr>
-        <w:t xml:space="preserve">Recetario</w:t>
-      </w:r>
-      <w:r>
-        <w:rPr>
-          <w:rFonts w:ascii="Arial" w:cs="Arial" w:eastAsia="Arial" w:hAnsi="Arial"/>
-          <w:sz w:val="22"/>
-          <w:szCs w:val="22"/>
-        </w:rPr>
-        <w:t xml:space="preserve"> permite consultar los ingredientes y la preparación de cada plato, útil para estandarizar la calidad.</w:t>
-      </w:r>
-    </w:p>
-    <w:p>
-      <w:pPr>
         <w:pBdr>
           <w:left w:val="single" w:color="6B1E2E" w:sz="18" w:space="8"/>
         </w:pBdr>
@@ -4743,541 +4692,6 @@
     </w:p>
     <w:p>
       <w:pPr>
-        <w:spacing w:after="120"/>
-      </w:pPr>
-    </w:p>
-    <w:p>
-      <w:pPr>
-        <w:pBdr>
-          <w:bottom w:val="single" w:color="D9CBB8" w:sz="6" w:space="1"/>
-        </w:pBdr>
-        <w:spacing w:after="160" w:before="120"/>
-      </w:pPr>
-    </w:p>
-    <w:p>
-      <w:pPr>
-        <w:pStyle w:val="Heading2"/>
-        <w:keepNext/>
-        <w:pageBreakBefore/>
-        <w:spacing w:after="120" w:before="280"/>
-        <w:jc w:val="left"/>
-      </w:pPr>
-      <w:r>
-        <w:rPr>
-          <w:rFonts w:ascii="Arial" w:cs="Arial" w:eastAsia="Arial" w:hAnsi="Arial"/>
-          <w:b/>
-          <w:bCs/>
-          <w:color w:val="6B1E2E"/>
-          <w:sz w:val="30"/>
-          <w:szCs w:val="30"/>
-        </w:rPr>
-        <w:t xml:space="preserve">6. Rol Cajero</w:t>
-      </w:r>
-    </w:p>
-    <w:p>
-      <w:pPr>
-        <w:spacing w:after="120" w:line="300"/>
-        <w:jc w:val="left"/>
-      </w:pPr>
-      <w:r>
-        <w:rPr>
-          <w:rFonts w:ascii="Arial" w:cs="Arial" w:eastAsia="Arial" w:hAnsi="Arial"/>
-          <w:b/>
-          <w:bCs/>
-          <w:sz w:val="22"/>
-          <w:szCs w:val="22"/>
-        </w:rPr>
-        <w:t xml:space="preserve">Inicio:</w:t>
-      </w:r>
-      <w:r>
-        <w:rPr>
-          <w:rFonts w:ascii="Arial" w:cs="Arial" w:eastAsia="Arial" w:hAnsi="Arial"/>
-          <w:sz w:val="22"/>
-          <w:szCs w:val="22"/>
-        </w:rPr>
-        <w:t xml:space="preserve"> </w:t>
-      </w:r>
-      <w:r>
-        <w:rPr>
-          <w:rFonts w:ascii="Arial" w:cs="Arial" w:eastAsia="Arial" w:hAnsi="Arial"/>
-          <w:b/>
-          <w:bCs/>
-          <w:sz w:val="22"/>
-          <w:szCs w:val="22"/>
-        </w:rPr>
-        <w:t xml:space="preserve">Caja</w:t>
-      </w:r>
-      <w:r>
-        <w:rPr>
-          <w:rFonts w:ascii="Arial" w:cs="Arial" w:eastAsia="Arial" w:hAnsi="Arial"/>
-          <w:sz w:val="22"/>
-          <w:szCs w:val="22"/>
-        </w:rPr>
-        <w:t xml:space="preserve">. Opciones: </w:t>
-      </w:r>
-      <w:r>
-        <w:rPr>
-          <w:rFonts w:ascii="Arial" w:cs="Arial" w:eastAsia="Arial" w:hAnsi="Arial"/>
-          <w:b/>
-          <w:bCs/>
-          <w:sz w:val="22"/>
-          <w:szCs w:val="22"/>
-        </w:rPr>
-        <w:t xml:space="preserve">Caja (turnos)</w:t>
-      </w:r>
-      <w:r>
-        <w:rPr>
-          <w:rFonts w:ascii="Arial" w:cs="Arial" w:eastAsia="Arial" w:hAnsi="Arial"/>
-          <w:sz w:val="22"/>
-          <w:szCs w:val="22"/>
-        </w:rPr>
-        <w:t xml:space="preserve">, </w:t>
-      </w:r>
-      <w:r>
-        <w:rPr>
-          <w:rFonts w:ascii="Arial" w:cs="Arial" w:eastAsia="Arial" w:hAnsi="Arial"/>
-          <w:b/>
-          <w:bCs/>
-          <w:sz w:val="22"/>
-          <w:szCs w:val="22"/>
-        </w:rPr>
-        <w:t xml:space="preserve">Facturas</w:t>
-      </w:r>
-      <w:r>
-        <w:rPr>
-          <w:rFonts w:ascii="Arial" w:cs="Arial" w:eastAsia="Arial" w:hAnsi="Arial"/>
-          <w:sz w:val="22"/>
-          <w:szCs w:val="22"/>
-        </w:rPr>
-        <w:t xml:space="preserve"> y </w:t>
-      </w:r>
-      <w:r>
-        <w:rPr>
-          <w:rFonts w:ascii="Arial" w:cs="Arial" w:eastAsia="Arial" w:hAnsi="Arial"/>
-          <w:b/>
-          <w:bCs/>
-          <w:sz w:val="22"/>
-          <w:szCs w:val="22"/>
-        </w:rPr>
-        <w:t xml:space="preserve">Pedidos</w:t>
-      </w:r>
-      <w:r>
-        <w:rPr>
-          <w:rFonts w:ascii="Arial" w:cs="Arial" w:eastAsia="Arial" w:hAnsi="Arial"/>
-          <w:sz w:val="22"/>
-          <w:szCs w:val="22"/>
-        </w:rPr>
-        <w:t xml:space="preserve">.</w:t>
-      </w:r>
-    </w:p>
-    <w:p>
-      <w:pPr>
-        <w:pStyle w:val="Heading3"/>
-        <w:keepNext/>
-        <w:spacing w:after="120" w:before="280"/>
-        <w:jc w:val="left"/>
-      </w:pPr>
-      <w:r>
-        <w:rPr>
-          <w:rFonts w:ascii="Arial" w:cs="Arial" w:eastAsia="Arial" w:hAnsi="Arial"/>
-          <w:b/>
-          <w:bCs/>
-          <w:color w:val="3A2B32"/>
-          <w:sz w:val="26"/>
-          <w:szCs w:val="26"/>
-        </w:rPr>
-        <w:t xml:space="preserve">6.1 Abrir el turno de caja</w:t>
-      </w:r>
-    </w:p>
-    <w:p>
-      <w:pPr>
-        <w:pStyle w:val="ListParagraph"/>
-        <w:numPr>
-          <w:ilvl w:val="0"/>
-          <w:numId w:val="13"/>
-        </w:numPr>
-        <w:spacing w:after="60"/>
-      </w:pPr>
-      <w:r>
-        <w:rPr>
-          <w:rFonts w:ascii="Arial" w:cs="Arial" w:eastAsia="Arial" w:hAnsi="Arial"/>
-          <w:sz w:val="22"/>
-          <w:szCs w:val="22"/>
-        </w:rPr>
-        <w:t xml:space="preserve">Entre a </w:t>
-      </w:r>
-      <w:r>
-        <w:rPr>
-          <w:rFonts w:ascii="Arial" w:cs="Arial" w:eastAsia="Arial" w:hAnsi="Arial"/>
-          <w:b/>
-          <w:bCs/>
-          <w:sz w:val="22"/>
-          <w:szCs w:val="22"/>
-        </w:rPr>
-        <w:t xml:space="preserve">Caja</w:t>
-      </w:r>
-      <w:r>
-        <w:rPr>
-          <w:rFonts w:ascii="Arial" w:cs="Arial" w:eastAsia="Arial" w:hAnsi="Arial"/>
-          <w:sz w:val="22"/>
-          <w:szCs w:val="22"/>
-        </w:rPr>
-        <w:t xml:space="preserve">. Si no hay un turno abierto, el sistema lo indica.</w:t>
-      </w:r>
-    </w:p>
-    <w:p>
-      <w:pPr>
-        <w:pStyle w:val="ListParagraph"/>
-        <w:numPr>
-          <w:ilvl w:val="0"/>
-          <w:numId w:val="13"/>
-        </w:numPr>
-        <w:spacing w:after="60"/>
-      </w:pPr>
-      <w:r>
-        <w:rPr>
-          <w:rFonts w:ascii="Arial" w:cs="Arial" w:eastAsia="Arial" w:hAnsi="Arial"/>
-          <w:sz w:val="22"/>
-          <w:szCs w:val="22"/>
-        </w:rPr>
-        <w:t xml:space="preserve">Escriba la </w:t>
-      </w:r>
-      <w:r>
-        <w:rPr>
-          <w:rFonts w:ascii="Arial" w:cs="Arial" w:eastAsia="Arial" w:hAnsi="Arial"/>
-          <w:b/>
-          <w:bCs/>
-          <w:sz w:val="22"/>
-          <w:szCs w:val="22"/>
-        </w:rPr>
-        <w:t xml:space="preserve">base inicial en efectivo</w:t>
-      </w:r>
-      <w:r>
-        <w:rPr>
-          <w:rFonts w:ascii="Arial" w:cs="Arial" w:eastAsia="Arial" w:hAnsi="Arial"/>
-          <w:sz w:val="22"/>
-          <w:szCs w:val="22"/>
-        </w:rPr>
-        <w:t xml:space="preserve"> (monto con que arranca la caja) y, si lo desea, una observación.</w:t>
-      </w:r>
-    </w:p>
-    <w:p>
-      <w:pPr>
-        <w:pStyle w:val="ListParagraph"/>
-        <w:numPr>
-          <w:ilvl w:val="0"/>
-          <w:numId w:val="13"/>
-        </w:numPr>
-        <w:spacing w:after="60"/>
-      </w:pPr>
-      <w:r>
-        <w:rPr>
-          <w:rFonts w:ascii="Arial" w:cs="Arial" w:eastAsia="Arial" w:hAnsi="Arial"/>
-          <w:sz w:val="22"/>
-          <w:szCs w:val="22"/>
-        </w:rPr>
-        <w:t xml:space="preserve">Pulse </w:t>
-      </w:r>
-      <w:r>
-        <w:rPr>
-          <w:rFonts w:ascii="Arial" w:cs="Arial" w:eastAsia="Arial" w:hAnsi="Arial"/>
-          <w:b/>
-          <w:bCs/>
-          <w:sz w:val="22"/>
-          <w:szCs w:val="22"/>
-        </w:rPr>
-        <w:t xml:space="preserve">Abrir turno</w:t>
-      </w:r>
-      <w:r>
-        <w:rPr>
-          <w:rFonts w:ascii="Arial" w:cs="Arial" w:eastAsia="Arial" w:hAnsi="Arial"/>
-          <w:sz w:val="22"/>
-          <w:szCs w:val="22"/>
-        </w:rPr>
-        <w:t xml:space="preserve">. Se genera un </w:t>
-      </w:r>
-      <w:r>
-        <w:rPr>
-          <w:rFonts w:ascii="Arial" w:cs="Arial" w:eastAsia="Arial" w:hAnsi="Arial"/>
-          <w:b/>
-          <w:bCs/>
-          <w:sz w:val="22"/>
-          <w:szCs w:val="22"/>
-        </w:rPr>
-        <w:t xml:space="preserve">código de turno</w:t>
-      </w:r>
-      <w:r>
-        <w:rPr>
-          <w:rFonts w:ascii="Arial" w:cs="Arial" w:eastAsia="Arial" w:hAnsi="Arial"/>
-          <w:sz w:val="22"/>
-          <w:szCs w:val="22"/>
-        </w:rPr>
-        <w:t xml:space="preserve"> que identifica su jornada.</w:t>
-      </w:r>
-    </w:p>
-    <w:p>
-      <w:pPr>
-        <w:spacing w:after="60"/>
-      </w:pPr>
-    </w:p>
-    <w:p>
-      <w:pPr>
-        <w:spacing w:after="120" w:line="300"/>
-        <w:jc w:val="left"/>
-      </w:pPr>
-      <w:r>
-        <w:rPr>
-          <w:rFonts w:ascii="Arial" w:cs="Arial" w:eastAsia="Arial" w:hAnsi="Arial"/>
-          <w:b/>
-          <w:bCs/>
-          <w:sz w:val="22"/>
-          <w:szCs w:val="22"/>
-        </w:rPr>
-        <w:t xml:space="preserve">[Insertar captura: apertura de turno]</w:t>
-      </w:r>
-    </w:p>
-    <w:p>
-      <w:pPr>
-        <w:pStyle w:val="Heading3"/>
-        <w:keepNext/>
-        <w:spacing w:after="120" w:before="280"/>
-        <w:jc w:val="left"/>
-      </w:pPr>
-      <w:r>
-        <w:rPr>
-          <w:rFonts w:ascii="Arial" w:cs="Arial" w:eastAsia="Arial" w:hAnsi="Arial"/>
-          <w:b/>
-          <w:bCs/>
-          <w:color w:val="3A2B32"/>
-          <w:sz w:val="26"/>
-          <w:szCs w:val="26"/>
-        </w:rPr>
-        <w:t xml:space="preserve">6.2 Cobrar y facturar un pedido</w:t>
-      </w:r>
-    </w:p>
-    <w:p>
-      <w:pPr>
-        <w:pStyle w:val="ListParagraph"/>
-        <w:numPr>
-          <w:ilvl w:val="0"/>
-          <w:numId w:val="14"/>
-        </w:numPr>
-        <w:spacing w:after="60"/>
-      </w:pPr>
-      <w:r>
-        <w:rPr>
-          <w:rFonts w:ascii="Arial" w:cs="Arial" w:eastAsia="Arial" w:hAnsi="Arial"/>
-          <w:sz w:val="22"/>
-          <w:szCs w:val="22"/>
-        </w:rPr>
-        <w:t xml:space="preserve">Entre a </w:t>
-      </w:r>
-      <w:r>
-        <w:rPr>
-          <w:rFonts w:ascii="Arial" w:cs="Arial" w:eastAsia="Arial" w:hAnsi="Arial"/>
-          <w:b/>
-          <w:bCs/>
-          <w:sz w:val="22"/>
-          <w:szCs w:val="22"/>
-        </w:rPr>
-        <w:t xml:space="preserve">Pedidos</w:t>
-      </w:r>
-      <w:r>
-        <w:rPr>
-          <w:rFonts w:ascii="Arial" w:cs="Arial" w:eastAsia="Arial" w:hAnsi="Arial"/>
-          <w:sz w:val="22"/>
-          <w:szCs w:val="22"/>
-        </w:rPr>
-        <w:t xml:space="preserve"> y localice el pedido de la mesa o el domicilio.</w:t>
-      </w:r>
-    </w:p>
-    <w:p>
-      <w:pPr>
-        <w:pStyle w:val="ListParagraph"/>
-        <w:numPr>
-          <w:ilvl w:val="0"/>
-          <w:numId w:val="14"/>
-        </w:numPr>
-        <w:spacing w:after="60"/>
-      </w:pPr>
-      <w:r>
-        <w:rPr>
-          <w:rFonts w:ascii="Arial" w:cs="Arial" w:eastAsia="Arial" w:hAnsi="Arial"/>
-          <w:sz w:val="22"/>
-          <w:szCs w:val="22"/>
-        </w:rPr>
-        <w:t xml:space="preserve">Abra el detalle y verifique los platos y el total.</w:t>
-      </w:r>
-    </w:p>
-    <w:p>
-      <w:pPr>
-        <w:pStyle w:val="ListParagraph"/>
-        <w:numPr>
-          <w:ilvl w:val="0"/>
-          <w:numId w:val="14"/>
-        </w:numPr>
-        <w:spacing w:after="60"/>
-      </w:pPr>
-      <w:r>
-        <w:rPr>
-          <w:rFonts w:ascii="Arial" w:cs="Arial" w:eastAsia="Arial" w:hAnsi="Arial"/>
-          <w:sz w:val="22"/>
-          <w:szCs w:val="22"/>
-        </w:rPr>
-        <w:t xml:space="preserve">Pulse </w:t>
-      </w:r>
-      <w:r>
-        <w:rPr>
-          <w:rFonts w:ascii="Arial" w:cs="Arial" w:eastAsia="Arial" w:hAnsi="Arial"/>
-          <w:b/>
-          <w:bCs/>
-          <w:sz w:val="22"/>
-          <w:szCs w:val="22"/>
-        </w:rPr>
-        <w:t xml:space="preserve">Cobrar en Caja</w:t>
-      </w:r>
-      <w:r>
-        <w:rPr>
-          <w:rFonts w:ascii="Arial" w:cs="Arial" w:eastAsia="Arial" w:hAnsi="Arial"/>
-          <w:sz w:val="22"/>
-          <w:szCs w:val="22"/>
-        </w:rPr>
-        <w:t xml:space="preserve">, elija el </w:t>
-      </w:r>
-      <w:r>
-        <w:rPr>
-          <w:rFonts w:ascii="Arial" w:cs="Arial" w:eastAsia="Arial" w:hAnsi="Arial"/>
-          <w:b/>
-          <w:bCs/>
-          <w:sz w:val="22"/>
-          <w:szCs w:val="22"/>
-        </w:rPr>
-        <w:t xml:space="preserve">medio de pago</w:t>
-      </w:r>
-      <w:r>
-        <w:rPr>
-          <w:rFonts w:ascii="Arial" w:cs="Arial" w:eastAsia="Arial" w:hAnsi="Arial"/>
-          <w:sz w:val="22"/>
-          <w:szCs w:val="22"/>
-        </w:rPr>
-        <w:t xml:space="preserve"> (efectivo, tarjeta, Nequi, Daviplata o PSE) y, si el cliente lo autoriza, incluya la </w:t>
-      </w:r>
-      <w:r>
-        <w:rPr>
-          <w:rFonts w:ascii="Arial" w:cs="Arial" w:eastAsia="Arial" w:hAnsi="Arial"/>
-          <w:b/>
-          <w:bCs/>
-          <w:sz w:val="22"/>
-          <w:szCs w:val="22"/>
-        </w:rPr>
-        <w:t xml:space="preserve">propina sugerida del 10 %</w:t>
-      </w:r>
-      <w:r>
-        <w:rPr>
-          <w:rFonts w:ascii="Arial" w:cs="Arial" w:eastAsia="Arial" w:hAnsi="Arial"/>
-          <w:sz w:val="22"/>
-          <w:szCs w:val="22"/>
-        </w:rPr>
-        <w:t xml:space="preserve">.</w:t>
-      </w:r>
-    </w:p>
-    <w:p>
-      <w:pPr>
-        <w:pStyle w:val="ListParagraph"/>
-        <w:numPr>
-          <w:ilvl w:val="0"/>
-          <w:numId w:val="14"/>
-        </w:numPr>
-        <w:spacing w:after="60"/>
-      </w:pPr>
-      <w:r>
-        <w:rPr>
-          <w:rFonts w:ascii="Arial" w:cs="Arial" w:eastAsia="Arial" w:hAnsi="Arial"/>
-          <w:sz w:val="22"/>
-          <w:szCs w:val="22"/>
-        </w:rPr>
-        <w:t xml:space="preserve">El sistema emite la </w:t>
-      </w:r>
-      <w:r>
-        <w:rPr>
-          <w:rFonts w:ascii="Arial" w:cs="Arial" w:eastAsia="Arial" w:hAnsi="Arial"/>
-          <w:b/>
-          <w:bCs/>
-          <w:sz w:val="22"/>
-          <w:szCs w:val="22"/>
-        </w:rPr>
-        <w:t xml:space="preserve">factura</w:t>
-      </w:r>
-      <w:r>
-        <w:rPr>
-          <w:rFonts w:ascii="Arial" w:cs="Arial" w:eastAsia="Arial" w:hAnsi="Arial"/>
-          <w:sz w:val="22"/>
-          <w:szCs w:val="22"/>
-        </w:rPr>
-        <w:t xml:space="preserve"> con su número consecutivo, marca el pedido como </w:t>
-      </w:r>
-      <w:r>
-        <w:rPr>
-          <w:rFonts w:ascii="Arial" w:cs="Arial" w:eastAsia="Arial" w:hAnsi="Arial"/>
-          <w:b/>
-          <w:bCs/>
-          <w:sz w:val="22"/>
-          <w:szCs w:val="22"/>
-        </w:rPr>
-        <w:t xml:space="preserve">Facturado</w:t>
-      </w:r>
-      <w:r>
-        <w:rPr>
-          <w:rFonts w:ascii="Arial" w:cs="Arial" w:eastAsia="Arial" w:hAnsi="Arial"/>
-          <w:sz w:val="22"/>
-          <w:szCs w:val="22"/>
-        </w:rPr>
-        <w:t xml:space="preserve"> y libera la mesa.</w:t>
-      </w:r>
-    </w:p>
-    <w:p>
-      <w:pPr>
-        <w:pStyle w:val="ListParagraph"/>
-        <w:numPr>
-          <w:ilvl w:val="0"/>
-          <w:numId w:val="14"/>
-        </w:numPr>
-        <w:spacing w:after="60"/>
-      </w:pPr>
-      <w:r>
-        <w:rPr>
-          <w:rFonts w:ascii="Arial" w:cs="Arial" w:eastAsia="Arial" w:hAnsi="Arial"/>
-          <w:sz w:val="22"/>
-          <w:szCs w:val="22"/>
-        </w:rPr>
-        <w:t xml:space="preserve">Si el cliente pagó en línea con Wompi, el pedido ya aparece como </w:t>
-      </w:r>
-      <w:r>
-        <w:rPr>
-          <w:rFonts w:ascii="Arial" w:cs="Arial" w:eastAsia="Arial" w:hAnsi="Arial"/>
-          <w:b/>
-          <w:bCs/>
-          <w:sz w:val="22"/>
-          <w:szCs w:val="22"/>
-        </w:rPr>
-        <w:t xml:space="preserve">Facturado</w:t>
-      </w:r>
-      <w:r>
-        <w:rPr>
-          <w:rFonts w:ascii="Arial" w:cs="Arial" w:eastAsia="Arial" w:hAnsi="Arial"/>
-          <w:sz w:val="22"/>
-          <w:szCs w:val="22"/>
-        </w:rPr>
-        <w:t xml:space="preserve">; no debe cobrarse de nuevo.</w:t>
-      </w:r>
-    </w:p>
-    <w:p>
-      <w:pPr>
-        <w:spacing w:after="60"/>
-      </w:pPr>
-    </w:p>
-    <w:p>
-      <w:pPr>
         <w:pBdr>
           <w:left w:val="single" w:color="6B1E2E" w:sz="18" w:space="8"/>
         </w:pBdr>
@@ -5293,7 +4707,7 @@
           <w:sz w:val="22"/>
           <w:szCs w:val="22"/>
         </w:rPr>
-        <w:t xml:space="preserve">Los pagos reportados por un cliente mediante transferencia manual quedan </w:t>
+        <w:t xml:space="preserve">El </w:t>
       </w:r>
       <w:r>
         <w:rPr>
@@ -5303,7 +4717,7 @@
           <w:sz w:val="22"/>
           <w:szCs w:val="22"/>
         </w:rPr>
-        <w:t xml:space="preserve">pendientes de verificación</w:t>
+        <w:t xml:space="preserve">Recetario</w:t>
       </w:r>
       <w:r>
         <w:rPr>
@@ -5313,369 +4727,13 @@
           <w:sz w:val="22"/>
           <w:szCs w:val="22"/>
         </w:rPr>
-        <w:t xml:space="preserve">: el cajero comprueba el comprobante antes de aprobarlos.</w:t>
+        <w:t xml:space="preserve"> (fichas técnicas de los platos) es una opción del administrador, no del cocinero.</w:t>
       </w:r>
     </w:p>
     <w:p>
       <w:pPr>
         <w:spacing w:after="120"/>
       </w:pPr>
-    </w:p>
-    <w:p>
-      <w:pPr>
-        <w:spacing w:after="120" w:line="300"/>
-        <w:jc w:val="left"/>
-      </w:pPr>
-      <w:r>
-        <w:rPr>
-          <w:rFonts w:ascii="Arial" w:cs="Arial" w:eastAsia="Arial" w:hAnsi="Arial"/>
-          <w:b/>
-          <w:bCs/>
-          <w:sz w:val="22"/>
-          <w:szCs w:val="22"/>
-        </w:rPr>
-        <w:t xml:space="preserve">[Insertar captura: cobro en caja]</w:t>
-      </w:r>
-    </w:p>
-    <w:p>
-      <w:pPr>
-        <w:pStyle w:val="Heading3"/>
-        <w:keepNext/>
-        <w:spacing w:after="120" w:before="280"/>
-        <w:jc w:val="left"/>
-      </w:pPr>
-      <w:r>
-        <w:rPr>
-          <w:rFonts w:ascii="Arial" w:cs="Arial" w:eastAsia="Arial" w:hAnsi="Arial"/>
-          <w:b/>
-          <w:bCs/>
-          <w:color w:val="3A2B32"/>
-          <w:sz w:val="26"/>
-          <w:szCs w:val="26"/>
-        </w:rPr>
-        <w:t xml:space="preserve">6.3 Factura de venta directa</w:t>
-      </w:r>
-    </w:p>
-    <w:p>
-      <w:pPr>
-        <w:spacing w:after="120" w:line="300"/>
-        <w:jc w:val="left"/>
-      </w:pPr>
-      <w:r>
-        <w:rPr>
-          <w:rFonts w:ascii="Arial" w:cs="Arial" w:eastAsia="Arial" w:hAnsi="Arial"/>
-          <w:sz w:val="22"/>
-          <w:szCs w:val="22"/>
-        </w:rPr>
-        <w:t xml:space="preserve">En </w:t>
-      </w:r>
-      <w:r>
-        <w:rPr>
-          <w:rFonts w:ascii="Arial" w:cs="Arial" w:eastAsia="Arial" w:hAnsi="Arial"/>
-          <w:b/>
-          <w:bCs/>
-          <w:sz w:val="22"/>
-          <w:szCs w:val="22"/>
-        </w:rPr>
-        <w:t xml:space="preserve">Facturas ➜ Nueva</w:t>
-      </w:r>
-      <w:r>
-        <w:rPr>
-          <w:rFonts w:ascii="Arial" w:cs="Arial" w:eastAsia="Arial" w:hAnsi="Arial"/>
-          <w:sz w:val="22"/>
-          <w:szCs w:val="22"/>
-        </w:rPr>
-        <w:t xml:space="preserve"> puede registrar una venta sin pedido previo: seleccione los productos y cantidades, el cliente (o nombre libre) y el medio de pago.</w:t>
-      </w:r>
-    </w:p>
-    <w:p>
-      <w:pPr>
-        <w:pStyle w:val="Heading3"/>
-        <w:keepNext/>
-        <w:spacing w:after="120" w:before="280"/>
-        <w:jc w:val="left"/>
-      </w:pPr>
-      <w:r>
-        <w:rPr>
-          <w:rFonts w:ascii="Arial" w:cs="Arial" w:eastAsia="Arial" w:hAnsi="Arial"/>
-          <w:b/>
-          <w:bCs/>
-          <w:color w:val="3A2B32"/>
-          <w:sz w:val="26"/>
-          <w:szCs w:val="26"/>
-        </w:rPr>
-        <w:t xml:space="preserve">6.4 Anular una factura</w:t>
-      </w:r>
-    </w:p>
-    <w:p>
-      <w:pPr>
-        <w:spacing w:after="120" w:line="300"/>
-        <w:jc w:val="left"/>
-      </w:pPr>
-      <w:r>
-        <w:rPr>
-          <w:rFonts w:ascii="Arial" w:cs="Arial" w:eastAsia="Arial" w:hAnsi="Arial"/>
-          <w:sz w:val="22"/>
-          <w:szCs w:val="22"/>
-        </w:rPr>
-        <w:t xml:space="preserve">Abra la factura en </w:t>
-      </w:r>
-      <w:r>
-        <w:rPr>
-          <w:rFonts w:ascii="Arial" w:cs="Arial" w:eastAsia="Arial" w:hAnsi="Arial"/>
-          <w:b/>
-          <w:bCs/>
-          <w:sz w:val="22"/>
-          <w:szCs w:val="22"/>
-        </w:rPr>
-        <w:t xml:space="preserve">Facturas</w:t>
-      </w:r>
-      <w:r>
-        <w:rPr>
-          <w:rFonts w:ascii="Arial" w:cs="Arial" w:eastAsia="Arial" w:hAnsi="Arial"/>
-          <w:sz w:val="22"/>
-          <w:szCs w:val="22"/>
-        </w:rPr>
-        <w:t xml:space="preserve"> y pulse </w:t>
-      </w:r>
-      <w:r>
-        <w:rPr>
-          <w:rFonts w:ascii="Arial" w:cs="Arial" w:eastAsia="Arial" w:hAnsi="Arial"/>
-          <w:b/>
-          <w:bCs/>
-          <w:sz w:val="22"/>
-          <w:szCs w:val="22"/>
-        </w:rPr>
-        <w:t xml:space="preserve">Anular</w:t>
-      </w:r>
-      <w:r>
-        <w:rPr>
-          <w:rFonts w:ascii="Arial" w:cs="Arial" w:eastAsia="Arial" w:hAnsi="Arial"/>
-          <w:sz w:val="22"/>
-          <w:szCs w:val="22"/>
-        </w:rPr>
-        <w:t xml:space="preserve">. La anulación queda registrada con el usuario que la realizó.</w:t>
-      </w:r>
-    </w:p>
-    <w:p>
-      <w:pPr>
-        <w:pStyle w:val="Heading3"/>
-        <w:keepNext/>
-        <w:spacing w:after="120" w:before="280"/>
-        <w:jc w:val="left"/>
-      </w:pPr>
-      <w:r>
-        <w:rPr>
-          <w:rFonts w:ascii="Arial" w:cs="Arial" w:eastAsia="Arial" w:hAnsi="Arial"/>
-          <w:b/>
-          <w:bCs/>
-          <w:color w:val="3A2B32"/>
-          <w:sz w:val="26"/>
-          <w:szCs w:val="26"/>
-        </w:rPr>
-        <w:t xml:space="preserve">6.5 Cerrar el turno (arqueo)</w:t>
-      </w:r>
-    </w:p>
-    <w:p>
-      <w:pPr>
-        <w:pStyle w:val="ListParagraph"/>
-        <w:numPr>
-          <w:ilvl w:val="0"/>
-          <w:numId w:val="15"/>
-        </w:numPr>
-        <w:spacing w:after="60"/>
-      </w:pPr>
-      <w:r>
-        <w:rPr>
-          <w:rFonts w:ascii="Arial" w:cs="Arial" w:eastAsia="Arial" w:hAnsi="Arial"/>
-          <w:sz w:val="22"/>
-          <w:szCs w:val="22"/>
-        </w:rPr>
-        <w:t xml:space="preserve">Entre a </w:t>
-      </w:r>
-      <w:r>
-        <w:rPr>
-          <w:rFonts w:ascii="Arial" w:cs="Arial" w:eastAsia="Arial" w:hAnsi="Arial"/>
-          <w:b/>
-          <w:bCs/>
-          <w:sz w:val="22"/>
-          <w:szCs w:val="22"/>
-        </w:rPr>
-        <w:t xml:space="preserve">Caja</w:t>
-      </w:r>
-      <w:r>
-        <w:rPr>
-          <w:rFonts w:ascii="Arial" w:cs="Arial" w:eastAsia="Arial" w:hAnsi="Arial"/>
-          <w:sz w:val="22"/>
-          <w:szCs w:val="22"/>
-        </w:rPr>
-        <w:t xml:space="preserve">; el sistema muestra el </w:t>
-      </w:r>
-      <w:r>
-        <w:rPr>
-          <w:rFonts w:ascii="Arial" w:cs="Arial" w:eastAsia="Arial" w:hAnsi="Arial"/>
-          <w:b/>
-          <w:bCs/>
-          <w:sz w:val="22"/>
-          <w:szCs w:val="22"/>
-        </w:rPr>
-        <w:t xml:space="preserve">resumen en vivo</w:t>
-      </w:r>
-      <w:r>
-        <w:rPr>
-          <w:rFonts w:ascii="Arial" w:cs="Arial" w:eastAsia="Arial" w:hAnsi="Arial"/>
-          <w:sz w:val="22"/>
-          <w:szCs w:val="22"/>
-        </w:rPr>
-        <w:t xml:space="preserve"> del turno (ventas por medio de pago).</w:t>
-      </w:r>
-    </w:p>
-    <w:p>
-      <w:pPr>
-        <w:pStyle w:val="ListParagraph"/>
-        <w:numPr>
-          <w:ilvl w:val="0"/>
-          <w:numId w:val="15"/>
-        </w:numPr>
-        <w:spacing w:after="60"/>
-      </w:pPr>
-      <w:r>
-        <w:rPr>
-          <w:rFonts w:ascii="Arial" w:cs="Arial" w:eastAsia="Arial" w:hAnsi="Arial"/>
-          <w:sz w:val="22"/>
-          <w:szCs w:val="22"/>
-        </w:rPr>
-        <w:t xml:space="preserve">Cuente el efectivo y escríbalo en </w:t>
-      </w:r>
-      <w:r>
-        <w:rPr>
-          <w:rFonts w:ascii="Arial" w:cs="Arial" w:eastAsia="Arial" w:hAnsi="Arial"/>
-          <w:b/>
-          <w:bCs/>
-          <w:sz w:val="22"/>
-          <w:szCs w:val="22"/>
-        </w:rPr>
-        <w:t xml:space="preserve">Efectivo declarado</w:t>
-      </w:r>
-      <w:r>
-        <w:rPr>
-          <w:rFonts w:ascii="Arial" w:cs="Arial" w:eastAsia="Arial" w:hAnsi="Arial"/>
-          <w:sz w:val="22"/>
-          <w:szCs w:val="22"/>
-        </w:rPr>
-        <w:t xml:space="preserve">.</w:t>
-      </w:r>
-    </w:p>
-    <w:p>
-      <w:pPr>
-        <w:pStyle w:val="ListParagraph"/>
-        <w:numPr>
-          <w:ilvl w:val="0"/>
-          <w:numId w:val="15"/>
-        </w:numPr>
-        <w:spacing w:after="60"/>
-      </w:pPr>
-      <w:r>
-        <w:rPr>
-          <w:rFonts w:ascii="Arial" w:cs="Arial" w:eastAsia="Arial" w:hAnsi="Arial"/>
-          <w:sz w:val="22"/>
-          <w:szCs w:val="22"/>
-        </w:rPr>
-        <w:t xml:space="preserve">Pulse </w:t>
-      </w:r>
-      <w:r>
-        <w:rPr>
-          <w:rFonts w:ascii="Arial" w:cs="Arial" w:eastAsia="Arial" w:hAnsi="Arial"/>
-          <w:b/>
-          <w:bCs/>
-          <w:sz w:val="22"/>
-          <w:szCs w:val="22"/>
-        </w:rPr>
-        <w:t xml:space="preserve">Realizar Arqueo &amp; Cerrar Turno</w:t>
-      </w:r>
-      <w:r>
-        <w:rPr>
-          <w:rFonts w:ascii="Arial" w:cs="Arial" w:eastAsia="Arial" w:hAnsi="Arial"/>
-          <w:sz w:val="22"/>
-          <w:szCs w:val="22"/>
-        </w:rPr>
-        <w:t xml:space="preserve">. El sistema calcula la </w:t>
-      </w:r>
-      <w:r>
-        <w:rPr>
-          <w:rFonts w:ascii="Arial" w:cs="Arial" w:eastAsia="Arial" w:hAnsi="Arial"/>
-          <w:b/>
-          <w:bCs/>
-          <w:sz w:val="22"/>
-          <w:szCs w:val="22"/>
-        </w:rPr>
-        <w:t xml:space="preserve">diferencia</w:t>
-      </w:r>
-      <w:r>
-        <w:rPr>
-          <w:rFonts w:ascii="Arial" w:cs="Arial" w:eastAsia="Arial" w:hAnsi="Arial"/>
-          <w:sz w:val="22"/>
-          <w:szCs w:val="22"/>
-        </w:rPr>
-        <w:t xml:space="preserve"> entre el efectivo esperado y el declarado.</w:t>
-      </w:r>
-    </w:p>
-    <w:p>
-      <w:pPr>
-        <w:pStyle w:val="ListParagraph"/>
-        <w:numPr>
-          <w:ilvl w:val="0"/>
-          <w:numId w:val="15"/>
-        </w:numPr>
-        <w:spacing w:after="60"/>
-      </w:pPr>
-      <w:r>
-        <w:rPr>
-          <w:rFonts w:ascii="Arial" w:cs="Arial" w:eastAsia="Arial" w:hAnsi="Arial"/>
-          <w:sz w:val="22"/>
-          <w:szCs w:val="22"/>
-        </w:rPr>
-        <w:t xml:space="preserve">El turno queda en el </w:t>
-      </w:r>
-      <w:r>
-        <w:rPr>
-          <w:rFonts w:ascii="Arial" w:cs="Arial" w:eastAsia="Arial" w:hAnsi="Arial"/>
-          <w:b/>
-          <w:bCs/>
-          <w:sz w:val="22"/>
-          <w:szCs w:val="22"/>
-        </w:rPr>
-        <w:t xml:space="preserve">historial de turnos y arqueos</w:t>
-      </w:r>
-      <w:r>
-        <w:rPr>
-          <w:rFonts w:ascii="Arial" w:cs="Arial" w:eastAsia="Arial" w:hAnsi="Arial"/>
-          <w:sz w:val="22"/>
-          <w:szCs w:val="22"/>
-        </w:rPr>
-        <w:t xml:space="preserve">.</w:t>
-      </w:r>
-    </w:p>
-    <w:p>
-      <w:pPr>
-        <w:spacing w:after="60"/>
-      </w:pPr>
-    </w:p>
-    <w:p>
-      <w:pPr>
-        <w:spacing w:after="120" w:line="300"/>
-        <w:jc w:val="left"/>
-      </w:pPr>
-      <w:r>
-        <w:rPr>
-          <w:rFonts w:ascii="Arial" w:cs="Arial" w:eastAsia="Arial" w:hAnsi="Arial"/>
-          <w:b/>
-          <w:bCs/>
-          <w:sz w:val="22"/>
-          <w:szCs w:val="22"/>
-        </w:rPr>
-        <w:t xml:space="preserve">[Insertar captura: arqueo y cierre de turno]</w:t>
-      </w:r>
     </w:p>
     <w:p>
       <w:pPr>
@@ -5702,7 +4760,7 @@
           <w:sz w:val="30"/>
           <w:szCs w:val="30"/>
         </w:rPr>
-        <w:t xml:space="preserve">7. Rol Administrador</w:t>
+        <w:t xml:space="preserve">6. Rol Cajero</w:t>
       </w:r>
     </w:p>
     <w:p>
@@ -5736,15 +4794,69 @@
           <w:sz w:val="22"/>
           <w:szCs w:val="22"/>
         </w:rPr>
-        <w:t xml:space="preserve">Panel de indicadores</w:t>
-      </w:r>
-      <w:r>
-        <w:rPr>
-          <w:rFonts w:ascii="Arial" w:cs="Arial" w:eastAsia="Arial" w:hAnsi="Arial"/>
-          <w:sz w:val="22"/>
-          <w:szCs w:val="22"/>
-        </w:rPr>
-        <w:t xml:space="preserve">. El administrador accede a todos los módulos.</w:t>
+        <w:t xml:space="preserve">Caja</w:t>
+      </w:r>
+      <w:r>
+        <w:rPr>
+          <w:rFonts w:ascii="Arial" w:cs="Arial" w:eastAsia="Arial" w:hAnsi="Arial"/>
+          <w:sz w:val="22"/>
+          <w:szCs w:val="22"/>
+        </w:rPr>
+        <w:t xml:space="preserve">. Opciones: </w:t>
+      </w:r>
+      <w:r>
+        <w:rPr>
+          <w:rFonts w:ascii="Arial" w:cs="Arial" w:eastAsia="Arial" w:hAnsi="Arial"/>
+          <w:b/>
+          <w:bCs/>
+          <w:sz w:val="22"/>
+          <w:szCs w:val="22"/>
+        </w:rPr>
+        <w:t xml:space="preserve">Caja (turnos)</w:t>
+      </w:r>
+      <w:r>
+        <w:rPr>
+          <w:rFonts w:ascii="Arial" w:cs="Arial" w:eastAsia="Arial" w:hAnsi="Arial"/>
+          <w:sz w:val="22"/>
+          <w:szCs w:val="22"/>
+        </w:rPr>
+        <w:t xml:space="preserve">, </w:t>
+      </w:r>
+      <w:r>
+        <w:rPr>
+          <w:rFonts w:ascii="Arial" w:cs="Arial" w:eastAsia="Arial" w:hAnsi="Arial"/>
+          <w:b/>
+          <w:bCs/>
+          <w:sz w:val="22"/>
+          <w:szCs w:val="22"/>
+        </w:rPr>
+        <w:t xml:space="preserve">Facturas</w:t>
+      </w:r>
+      <w:r>
+        <w:rPr>
+          <w:rFonts w:ascii="Arial" w:cs="Arial" w:eastAsia="Arial" w:hAnsi="Arial"/>
+          <w:sz w:val="22"/>
+          <w:szCs w:val="22"/>
+        </w:rPr>
+        <w:t xml:space="preserve"> y </w:t>
+      </w:r>
+      <w:r>
+        <w:rPr>
+          <w:rFonts w:ascii="Arial" w:cs="Arial" w:eastAsia="Arial" w:hAnsi="Arial"/>
+          <w:b/>
+          <w:bCs/>
+          <w:sz w:val="22"/>
+          <w:szCs w:val="22"/>
+        </w:rPr>
+        <w:t xml:space="preserve">Pedidos</w:t>
+      </w:r>
+      <w:r>
+        <w:rPr>
+          <w:rFonts w:ascii="Arial" w:cs="Arial" w:eastAsia="Arial" w:hAnsi="Arial"/>
+          <w:sz w:val="22"/>
+          <w:szCs w:val="22"/>
+        </w:rPr>
+        <w:t xml:space="preserve">.</w:t>
       </w:r>
     </w:p>
     <w:p>
@@ -5763,8 +4875,139 @@
           <w:sz w:val="26"/>
           <w:szCs w:val="26"/>
         </w:rPr>
-        <w:t xml:space="preserve">7.1 Panel de indicadores</w:t>
-      </w:r>
+        <w:t xml:space="preserve">6.1 Abrir el turno de caja</w:t>
+      </w:r>
+    </w:p>
+    <w:p>
+      <w:pPr>
+        <w:pStyle w:val="ListParagraph"/>
+        <w:numPr>
+          <w:ilvl w:val="0"/>
+          <w:numId w:val="13"/>
+        </w:numPr>
+        <w:spacing w:after="60"/>
+      </w:pPr>
+      <w:r>
+        <w:rPr>
+          <w:rFonts w:ascii="Arial" w:cs="Arial" w:eastAsia="Arial" w:hAnsi="Arial"/>
+          <w:sz w:val="22"/>
+          <w:szCs w:val="22"/>
+        </w:rPr>
+        <w:t xml:space="preserve">Entre a </w:t>
+      </w:r>
+      <w:r>
+        <w:rPr>
+          <w:rFonts w:ascii="Arial" w:cs="Arial" w:eastAsia="Arial" w:hAnsi="Arial"/>
+          <w:b/>
+          <w:bCs/>
+          <w:sz w:val="22"/>
+          <w:szCs w:val="22"/>
+        </w:rPr>
+        <w:t xml:space="preserve">Caja</w:t>
+      </w:r>
+      <w:r>
+        <w:rPr>
+          <w:rFonts w:ascii="Arial" w:cs="Arial" w:eastAsia="Arial" w:hAnsi="Arial"/>
+          <w:sz w:val="22"/>
+          <w:szCs w:val="22"/>
+        </w:rPr>
+        <w:t xml:space="preserve">. Si no hay un turno abierto, el sistema lo indica.</w:t>
+      </w:r>
+    </w:p>
+    <w:p>
+      <w:pPr>
+        <w:pStyle w:val="ListParagraph"/>
+        <w:numPr>
+          <w:ilvl w:val="0"/>
+          <w:numId w:val="13"/>
+        </w:numPr>
+        <w:spacing w:after="60"/>
+      </w:pPr>
+      <w:r>
+        <w:rPr>
+          <w:rFonts w:ascii="Arial" w:cs="Arial" w:eastAsia="Arial" w:hAnsi="Arial"/>
+          <w:sz w:val="22"/>
+          <w:szCs w:val="22"/>
+        </w:rPr>
+        <w:t xml:space="preserve">Escriba la </w:t>
+      </w:r>
+      <w:r>
+        <w:rPr>
+          <w:rFonts w:ascii="Arial" w:cs="Arial" w:eastAsia="Arial" w:hAnsi="Arial"/>
+          <w:b/>
+          <w:bCs/>
+          <w:sz w:val="22"/>
+          <w:szCs w:val="22"/>
+        </w:rPr>
+        <w:t xml:space="preserve">base inicial en efectivo</w:t>
+      </w:r>
+      <w:r>
+        <w:rPr>
+          <w:rFonts w:ascii="Arial" w:cs="Arial" w:eastAsia="Arial" w:hAnsi="Arial"/>
+          <w:sz w:val="22"/>
+          <w:szCs w:val="22"/>
+        </w:rPr>
+        <w:t xml:space="preserve"> (monto con que arranca la caja) y, si lo desea, una observación.</w:t>
+      </w:r>
+    </w:p>
+    <w:p>
+      <w:pPr>
+        <w:pStyle w:val="ListParagraph"/>
+        <w:numPr>
+          <w:ilvl w:val="0"/>
+          <w:numId w:val="13"/>
+        </w:numPr>
+        <w:spacing w:after="60"/>
+      </w:pPr>
+      <w:r>
+        <w:rPr>
+          <w:rFonts w:ascii="Arial" w:cs="Arial" w:eastAsia="Arial" w:hAnsi="Arial"/>
+          <w:sz w:val="22"/>
+          <w:szCs w:val="22"/>
+        </w:rPr>
+        <w:t xml:space="preserve">Pulse </w:t>
+      </w:r>
+      <w:r>
+        <w:rPr>
+          <w:rFonts w:ascii="Arial" w:cs="Arial" w:eastAsia="Arial" w:hAnsi="Arial"/>
+          <w:b/>
+          <w:bCs/>
+          <w:sz w:val="22"/>
+          <w:szCs w:val="22"/>
+        </w:rPr>
+        <w:t xml:space="preserve">Abrir turno</w:t>
+      </w:r>
+      <w:r>
+        <w:rPr>
+          <w:rFonts w:ascii="Arial" w:cs="Arial" w:eastAsia="Arial" w:hAnsi="Arial"/>
+          <w:sz w:val="22"/>
+          <w:szCs w:val="22"/>
+        </w:rPr>
+        <w:t xml:space="preserve">. Se genera un </w:t>
+      </w:r>
+      <w:r>
+        <w:rPr>
+          <w:rFonts w:ascii="Arial" w:cs="Arial" w:eastAsia="Arial" w:hAnsi="Arial"/>
+          <w:b/>
+          <w:bCs/>
+          <w:sz w:val="22"/>
+          <w:szCs w:val="22"/>
+        </w:rPr>
+        <w:t xml:space="preserve">código de turno</w:t>
+      </w:r>
+      <w:r>
+        <w:rPr>
+          <w:rFonts w:ascii="Arial" w:cs="Arial" w:eastAsia="Arial" w:hAnsi="Arial"/>
+          <w:sz w:val="22"/>
+          <w:szCs w:val="22"/>
+        </w:rPr>
+        <w:t xml:space="preserve"> que identifica su jornada.</w:t>
+      </w:r>
+    </w:p>
+    <w:p>
+      <w:pPr>
+        <w:spacing w:after="60"/>
+      </w:pPr>
     </w:p>
     <w:p>
       <w:pPr>
@@ -5774,217 +5017,12 @@
       <w:r>
         <w:rPr>
           <w:rFonts w:ascii="Arial" w:cs="Arial" w:eastAsia="Arial" w:hAnsi="Arial"/>
-          <w:sz w:val="22"/>
-          <w:szCs w:val="22"/>
-        </w:rPr>
-        <w:t xml:space="preserve">Al ingresar se muestra la </w:t>
-      </w:r>
-      <w:r>
-        <w:rPr>
-          <w:rFonts w:ascii="Arial" w:cs="Arial" w:eastAsia="Arial" w:hAnsi="Arial"/>
-          <w:b/>
-          <w:bCs/>
-          <w:sz w:val="22"/>
-          <w:szCs w:val="22"/>
-        </w:rPr>
-        <w:t xml:space="preserve">Operación de hoy</w:t>
-      </w:r>
-      <w:r>
-        <w:rPr>
-          <w:rFonts w:ascii="Arial" w:cs="Arial" w:eastAsia="Arial" w:hAnsi="Arial"/>
-          <w:sz w:val="22"/>
-          <w:szCs w:val="22"/>
-        </w:rPr>
-        <w:t xml:space="preserve">:</w:t>
-      </w:r>
-    </w:p>
-    <w:p>
-      <w:pPr>
-        <w:pStyle w:val="ListParagraph"/>
-        <w:numPr>
-          <w:ilvl w:val="0"/>
-          <w:numId w:val="3"/>
-        </w:numPr>
-        <w:spacing w:after="60"/>
-      </w:pPr>
-      <w:r>
-        <w:rPr>
-          <w:rFonts w:ascii="Arial" w:cs="Arial" w:eastAsia="Arial" w:hAnsi="Arial"/>
-          <w:b/>
-          <w:bCs/>
-          <w:sz w:val="22"/>
-          <w:szCs w:val="22"/>
-        </w:rPr>
-        <w:t xml:space="preserve">Ventas del día</w:t>
-      </w:r>
-      <w:r>
-        <w:rPr>
-          <w:rFonts w:ascii="Arial" w:cs="Arial" w:eastAsia="Arial" w:hAnsi="Arial"/>
-          <w:sz w:val="22"/>
-          <w:szCs w:val="22"/>
-        </w:rPr>
-        <w:t xml:space="preserve"> y su comparación con el promedio diario de los siete días anteriores.</w:t>
-      </w:r>
-    </w:p>
-    <w:p>
-      <w:pPr>
-        <w:pStyle w:val="ListParagraph"/>
-        <w:numPr>
-          <w:ilvl w:val="0"/>
-          <w:numId w:val="3"/>
-        </w:numPr>
-        <w:spacing w:after="60"/>
-      </w:pPr>
-      <w:r>
-        <w:rPr>
-          <w:rFonts w:ascii="Arial" w:cs="Arial" w:eastAsia="Arial" w:hAnsi="Arial"/>
-          <w:b/>
-          <w:bCs/>
-          <w:sz w:val="22"/>
-          <w:szCs w:val="22"/>
-        </w:rPr>
-        <w:t xml:space="preserve">Pedidos activos</w:t>
-      </w:r>
-      <w:r>
-        <w:rPr>
-          <w:rFonts w:ascii="Arial" w:cs="Arial" w:eastAsia="Arial" w:hAnsi="Arial"/>
-          <w:sz w:val="22"/>
-          <w:szCs w:val="22"/>
-        </w:rPr>
-        <w:t xml:space="preserve"> y domicilios en ruta.</w:t>
-      </w:r>
-    </w:p>
-    <w:p>
-      <w:pPr>
-        <w:pStyle w:val="ListParagraph"/>
-        <w:numPr>
-          <w:ilvl w:val="0"/>
-          <w:numId w:val="3"/>
-        </w:numPr>
-        <w:spacing w:after="60"/>
-      </w:pPr>
-      <w:r>
-        <w:rPr>
-          <w:rFonts w:ascii="Arial" w:cs="Arial" w:eastAsia="Arial" w:hAnsi="Arial"/>
-          <w:b/>
-          <w:bCs/>
-          <w:sz w:val="22"/>
-          <w:szCs w:val="22"/>
-        </w:rPr>
-        <w:t xml:space="preserve">Ocupación del salón</w:t>
-      </w:r>
-      <w:r>
-        <w:rPr>
-          <w:rFonts w:ascii="Arial" w:cs="Arial" w:eastAsia="Arial" w:hAnsi="Arial"/>
-          <w:sz w:val="22"/>
-          <w:szCs w:val="22"/>
-        </w:rPr>
-        <w:t xml:space="preserve"> (mesas ocupadas frente al total).</w:t>
-      </w:r>
-    </w:p>
-    <w:p>
-      <w:pPr>
-        <w:pStyle w:val="ListParagraph"/>
-        <w:numPr>
-          <w:ilvl w:val="0"/>
-          <w:numId w:val="3"/>
-        </w:numPr>
-        <w:spacing w:after="60"/>
-      </w:pPr>
-      <w:r>
-        <w:rPr>
-          <w:rFonts w:ascii="Arial" w:cs="Arial" w:eastAsia="Arial" w:hAnsi="Arial"/>
-          <w:b/>
-          <w:bCs/>
-          <w:sz w:val="22"/>
-          <w:szCs w:val="22"/>
-        </w:rPr>
-        <w:t xml:space="preserve">Reservas del día</w:t>
-      </w:r>
-      <w:r>
-        <w:rPr>
-          <w:rFonts w:ascii="Arial" w:cs="Arial" w:eastAsia="Arial" w:hAnsi="Arial"/>
-          <w:sz w:val="22"/>
-          <w:szCs w:val="22"/>
-        </w:rPr>
-        <w:t xml:space="preserve"> y próximas reservas.</w:t>
-      </w:r>
-    </w:p>
-    <w:p>
-      <w:pPr>
-        <w:pStyle w:val="ListParagraph"/>
-        <w:numPr>
-          <w:ilvl w:val="0"/>
-          <w:numId w:val="3"/>
-        </w:numPr>
-        <w:spacing w:after="60"/>
-      </w:pPr>
-      <w:r>
-        <w:rPr>
-          <w:rFonts w:ascii="Arial" w:cs="Arial" w:eastAsia="Arial" w:hAnsi="Arial"/>
-          <w:b/>
-          <w:bCs/>
-          <w:sz w:val="22"/>
-          <w:szCs w:val="22"/>
-        </w:rPr>
-        <w:t xml:space="preserve">Alertas de inventario</w:t>
-      </w:r>
-      <w:r>
-        <w:rPr>
-          <w:rFonts w:ascii="Arial" w:cs="Arial" w:eastAsia="Arial" w:hAnsi="Arial"/>
-          <w:sz w:val="22"/>
-          <w:szCs w:val="22"/>
-        </w:rPr>
-        <w:t xml:space="preserve"> (productos con stock crítico).</w:t>
-      </w:r>
-    </w:p>
-    <w:p>
-      <w:pPr>
-        <w:pStyle w:val="ListParagraph"/>
-        <w:numPr>
-          <w:ilvl w:val="0"/>
-          <w:numId w:val="3"/>
-        </w:numPr>
-        <w:spacing w:after="60"/>
-      </w:pPr>
-      <w:r>
-        <w:rPr>
-          <w:rFonts w:ascii="Arial" w:cs="Arial" w:eastAsia="Arial" w:hAnsi="Arial"/>
-          <w:b/>
-          <w:bCs/>
-          <w:sz w:val="22"/>
-          <w:szCs w:val="22"/>
-        </w:rPr>
-        <w:t xml:space="preserve">Curva de facturación y demanda</w:t>
-      </w:r>
-      <w:r>
-        <w:rPr>
-          <w:rFonts w:ascii="Arial" w:cs="Arial" w:eastAsia="Arial" w:hAnsi="Arial"/>
-          <w:sz w:val="22"/>
-          <w:szCs w:val="22"/>
-        </w:rPr>
-        <w:t xml:space="preserve"> y tiempo medio de domicilio.</w:t>
-      </w:r>
-    </w:p>
-    <w:p>
-      <w:pPr>
-        <w:spacing w:after="60"/>
-      </w:pPr>
-    </w:p>
-    <w:p>
-      <w:pPr>
-        <w:spacing w:after="120" w:line="300"/>
-        <w:jc w:val="left"/>
-      </w:pPr>
-      <w:r>
-        <w:rPr>
-          <w:rFonts w:ascii="Arial" w:cs="Arial" w:eastAsia="Arial" w:hAnsi="Arial"/>
-          <w:b/>
-          <w:bCs/>
-          <w:sz w:val="22"/>
-          <w:szCs w:val="22"/>
-        </w:rPr>
-        <w:t xml:space="preserve">[Insertar captura: panel de indicadores]</w:t>
+          <w:b/>
+          <w:bCs/>
+          <w:sz w:val="22"/>
+          <w:szCs w:val="22"/>
+        </w:rPr>
+        <w:t xml:space="preserve">[Insertar captura: apertura de turno]</w:t>
       </w:r>
     </w:p>
     <w:p>
@@ -6003,142 +5041,273 @@
           <w:sz w:val="26"/>
           <w:szCs w:val="26"/>
         </w:rPr>
-        <w:t xml:space="preserve">7.2 Informes y exportaciones</w:t>
-      </w:r>
-    </w:p>
-    <w:p>
-      <w:pPr>
-        <w:pStyle w:val="ListParagraph"/>
-        <w:numPr>
-          <w:ilvl w:val="0"/>
-          <w:numId w:val="3"/>
-        </w:numPr>
-        <w:spacing w:after="60"/>
-      </w:pPr>
-      <w:r>
-        <w:rPr>
-          <w:rFonts w:ascii="Arial" w:cs="Arial" w:eastAsia="Arial" w:hAnsi="Arial"/>
-          <w:b/>
-          <w:bCs/>
-          <w:sz w:val="22"/>
-          <w:szCs w:val="22"/>
-        </w:rPr>
-        <w:t xml:space="preserve">Facturas:</w:t>
-      </w:r>
-      <w:r>
-        <w:rPr>
-          <w:rFonts w:ascii="Arial" w:cs="Arial" w:eastAsia="Arial" w:hAnsi="Arial"/>
-          <w:sz w:val="22"/>
-          <w:szCs w:val="22"/>
-        </w:rPr>
-        <w:t xml:space="preserve"> filtre por fechas, cliente, cajero o estado y exporte el listado en </w:t>
-      </w:r>
-      <w:r>
-        <w:rPr>
-          <w:rFonts w:ascii="Arial" w:cs="Arial" w:eastAsia="Arial" w:hAnsi="Arial"/>
-          <w:b/>
-          <w:bCs/>
-          <w:sz w:val="22"/>
-          <w:szCs w:val="22"/>
-        </w:rPr>
-        <w:t xml:space="preserve">CSV</w:t>
-      </w:r>
-      <w:r>
-        <w:rPr>
-          <w:rFonts w:ascii="Arial" w:cs="Arial" w:eastAsia="Arial" w:hAnsi="Arial"/>
-          <w:sz w:val="22"/>
-          <w:szCs w:val="22"/>
-        </w:rPr>
-        <w:t xml:space="preserve"> (resumido o detallado).</w:t>
-      </w:r>
-    </w:p>
-    <w:p>
-      <w:pPr>
-        <w:pStyle w:val="ListParagraph"/>
-        <w:numPr>
-          <w:ilvl w:val="0"/>
-          <w:numId w:val="3"/>
-        </w:numPr>
-        <w:spacing w:after="60"/>
-      </w:pPr>
-      <w:r>
-        <w:rPr>
-          <w:rFonts w:ascii="Arial" w:cs="Arial" w:eastAsia="Arial" w:hAnsi="Arial"/>
-          <w:b/>
-          <w:bCs/>
-          <w:sz w:val="22"/>
-          <w:szCs w:val="22"/>
-        </w:rPr>
-        <w:t xml:space="preserve">Historial de turnos de caja:</w:t>
-      </w:r>
-      <w:r>
-        <w:rPr>
-          <w:rFonts w:ascii="Arial" w:cs="Arial" w:eastAsia="Arial" w:hAnsi="Arial"/>
-          <w:sz w:val="22"/>
-          <w:szCs w:val="22"/>
-        </w:rPr>
-        <w:t xml:space="preserve"> exportable a CSV.</w:t>
-      </w:r>
-    </w:p>
-    <w:p>
-      <w:pPr>
-        <w:pStyle w:val="ListParagraph"/>
-        <w:numPr>
-          <w:ilvl w:val="0"/>
-          <w:numId w:val="3"/>
-        </w:numPr>
-        <w:spacing w:after="60"/>
-      </w:pPr>
-      <w:r>
-        <w:rPr>
-          <w:rFonts w:ascii="Arial" w:cs="Arial" w:eastAsia="Arial" w:hAnsi="Arial"/>
-          <w:b/>
-          <w:bCs/>
-          <w:sz w:val="22"/>
-          <w:szCs w:val="22"/>
-        </w:rPr>
-        <w:t xml:space="preserve">Reservas:</w:t>
-      </w:r>
-      <w:r>
-        <w:rPr>
-          <w:rFonts w:ascii="Arial" w:cs="Arial" w:eastAsia="Arial" w:hAnsi="Arial"/>
-          <w:sz w:val="22"/>
-          <w:szCs w:val="22"/>
-        </w:rPr>
-        <w:t xml:space="preserve"> filtre por día, estado o búsqueda y exporte a CSV.</w:t>
-      </w:r>
-    </w:p>
-    <w:p>
-      <w:pPr>
-        <w:pStyle w:val="ListParagraph"/>
-        <w:numPr>
-          <w:ilvl w:val="0"/>
-          <w:numId w:val="3"/>
-        </w:numPr>
-        <w:spacing w:after="60"/>
-      </w:pPr>
-      <w:r>
-        <w:rPr>
-          <w:rFonts w:ascii="Arial" w:cs="Arial" w:eastAsia="Arial" w:hAnsi="Arial"/>
-          <w:b/>
-          <w:bCs/>
-          <w:sz w:val="22"/>
-          <w:szCs w:val="22"/>
-        </w:rPr>
-        <w:t xml:space="preserve">Auditoría:</w:t>
-      </w:r>
-      <w:r>
-        <w:rPr>
-          <w:rFonts w:ascii="Arial" w:cs="Arial" w:eastAsia="Arial" w:hAnsi="Arial"/>
-          <w:sz w:val="22"/>
-          <w:szCs w:val="22"/>
-        </w:rPr>
-        <w:t xml:space="preserve"> consulte quién hizo cada acción importante (fecha, usuario, módulo y detalle) y expórtela a CSV.</w:t>
-      </w:r>
-    </w:p>
-    <w:p>
-      <w:pPr>
-        <w:spacing w:after="60"/>
+        <w:t xml:space="preserve">6.2 Cobrar y facturar un pedido</w:t>
+      </w:r>
+    </w:p>
+    <w:p>
+      <w:pPr>
+        <w:pStyle w:val="ListParagraph"/>
+        <w:numPr>
+          <w:ilvl w:val="0"/>
+          <w:numId w:val="14"/>
+        </w:numPr>
+        <w:spacing w:after="60"/>
+      </w:pPr>
+      <w:r>
+        <w:rPr>
+          <w:rFonts w:ascii="Arial" w:cs="Arial" w:eastAsia="Arial" w:hAnsi="Arial"/>
+          <w:sz w:val="22"/>
+          <w:szCs w:val="22"/>
+        </w:rPr>
+        <w:t xml:space="preserve">Entre a </w:t>
+      </w:r>
+      <w:r>
+        <w:rPr>
+          <w:rFonts w:ascii="Arial" w:cs="Arial" w:eastAsia="Arial" w:hAnsi="Arial"/>
+          <w:b/>
+          <w:bCs/>
+          <w:sz w:val="22"/>
+          <w:szCs w:val="22"/>
+        </w:rPr>
+        <w:t xml:space="preserve">Pedidos</w:t>
+      </w:r>
+      <w:r>
+        <w:rPr>
+          <w:rFonts w:ascii="Arial" w:cs="Arial" w:eastAsia="Arial" w:hAnsi="Arial"/>
+          <w:sz w:val="22"/>
+          <w:szCs w:val="22"/>
+        </w:rPr>
+        <w:t xml:space="preserve"> y localice el pedido de la mesa o el domicilio.</w:t>
+      </w:r>
+    </w:p>
+    <w:p>
+      <w:pPr>
+        <w:pStyle w:val="ListParagraph"/>
+        <w:numPr>
+          <w:ilvl w:val="0"/>
+          <w:numId w:val="14"/>
+        </w:numPr>
+        <w:spacing w:after="60"/>
+      </w:pPr>
+      <w:r>
+        <w:rPr>
+          <w:rFonts w:ascii="Arial" w:cs="Arial" w:eastAsia="Arial" w:hAnsi="Arial"/>
+          <w:sz w:val="22"/>
+          <w:szCs w:val="22"/>
+        </w:rPr>
+        <w:t xml:space="preserve">Abra el detalle y verifique los platos y el total.</w:t>
+      </w:r>
+    </w:p>
+    <w:p>
+      <w:pPr>
+        <w:pStyle w:val="ListParagraph"/>
+        <w:numPr>
+          <w:ilvl w:val="0"/>
+          <w:numId w:val="14"/>
+        </w:numPr>
+        <w:spacing w:after="60"/>
+      </w:pPr>
+      <w:r>
+        <w:rPr>
+          <w:rFonts w:ascii="Arial" w:cs="Arial" w:eastAsia="Arial" w:hAnsi="Arial"/>
+          <w:sz w:val="22"/>
+          <w:szCs w:val="22"/>
+        </w:rPr>
+        <w:t xml:space="preserve">Pulse </w:t>
+      </w:r>
+      <w:r>
+        <w:rPr>
+          <w:rFonts w:ascii="Arial" w:cs="Arial" w:eastAsia="Arial" w:hAnsi="Arial"/>
+          <w:b/>
+          <w:bCs/>
+          <w:sz w:val="22"/>
+          <w:szCs w:val="22"/>
+        </w:rPr>
+        <w:t xml:space="preserve">Cobrar en Caja</w:t>
+      </w:r>
+      <w:r>
+        <w:rPr>
+          <w:rFonts w:ascii="Arial" w:cs="Arial" w:eastAsia="Arial" w:hAnsi="Arial"/>
+          <w:sz w:val="22"/>
+          <w:szCs w:val="22"/>
+        </w:rPr>
+        <w:t xml:space="preserve">, elija el </w:t>
+      </w:r>
+      <w:r>
+        <w:rPr>
+          <w:rFonts w:ascii="Arial" w:cs="Arial" w:eastAsia="Arial" w:hAnsi="Arial"/>
+          <w:b/>
+          <w:bCs/>
+          <w:sz w:val="22"/>
+          <w:szCs w:val="22"/>
+        </w:rPr>
+        <w:t xml:space="preserve">medio de pago</w:t>
+      </w:r>
+      <w:r>
+        <w:rPr>
+          <w:rFonts w:ascii="Arial" w:cs="Arial" w:eastAsia="Arial" w:hAnsi="Arial"/>
+          <w:sz w:val="22"/>
+          <w:szCs w:val="22"/>
+        </w:rPr>
+        <w:t xml:space="preserve"> (efectivo, tarjeta, Nequi, Daviplata o PSE) y, si el cliente lo autoriza, incluya la </w:t>
+      </w:r>
+      <w:r>
+        <w:rPr>
+          <w:rFonts w:ascii="Arial" w:cs="Arial" w:eastAsia="Arial" w:hAnsi="Arial"/>
+          <w:b/>
+          <w:bCs/>
+          <w:sz w:val="22"/>
+          <w:szCs w:val="22"/>
+        </w:rPr>
+        <w:t xml:space="preserve">propina sugerida del 10 %</w:t>
+      </w:r>
+      <w:r>
+        <w:rPr>
+          <w:rFonts w:ascii="Arial" w:cs="Arial" w:eastAsia="Arial" w:hAnsi="Arial"/>
+          <w:sz w:val="22"/>
+          <w:szCs w:val="22"/>
+        </w:rPr>
+        <w:t xml:space="preserve">.</w:t>
+      </w:r>
+    </w:p>
+    <w:p>
+      <w:pPr>
+        <w:pStyle w:val="ListParagraph"/>
+        <w:numPr>
+          <w:ilvl w:val="0"/>
+          <w:numId w:val="14"/>
+        </w:numPr>
+        <w:spacing w:after="60"/>
+      </w:pPr>
+      <w:r>
+        <w:rPr>
+          <w:rFonts w:ascii="Arial" w:cs="Arial" w:eastAsia="Arial" w:hAnsi="Arial"/>
+          <w:sz w:val="22"/>
+          <w:szCs w:val="22"/>
+        </w:rPr>
+        <w:t xml:space="preserve">El sistema emite la </w:t>
+      </w:r>
+      <w:r>
+        <w:rPr>
+          <w:rFonts w:ascii="Arial" w:cs="Arial" w:eastAsia="Arial" w:hAnsi="Arial"/>
+          <w:b/>
+          <w:bCs/>
+          <w:sz w:val="22"/>
+          <w:szCs w:val="22"/>
+        </w:rPr>
+        <w:t xml:space="preserve">factura</w:t>
+      </w:r>
+      <w:r>
+        <w:rPr>
+          <w:rFonts w:ascii="Arial" w:cs="Arial" w:eastAsia="Arial" w:hAnsi="Arial"/>
+          <w:sz w:val="22"/>
+          <w:szCs w:val="22"/>
+        </w:rPr>
+        <w:t xml:space="preserve"> con su número consecutivo, marca el pedido como </w:t>
+      </w:r>
+      <w:r>
+        <w:rPr>
+          <w:rFonts w:ascii="Arial" w:cs="Arial" w:eastAsia="Arial" w:hAnsi="Arial"/>
+          <w:b/>
+          <w:bCs/>
+          <w:sz w:val="22"/>
+          <w:szCs w:val="22"/>
+        </w:rPr>
+        <w:t xml:space="preserve">Facturado</w:t>
+      </w:r>
+      <w:r>
+        <w:rPr>
+          <w:rFonts w:ascii="Arial" w:cs="Arial" w:eastAsia="Arial" w:hAnsi="Arial"/>
+          <w:sz w:val="22"/>
+          <w:szCs w:val="22"/>
+        </w:rPr>
+        <w:t xml:space="preserve"> y libera la mesa.</w:t>
+      </w:r>
+    </w:p>
+    <w:p>
+      <w:pPr>
+        <w:pStyle w:val="ListParagraph"/>
+        <w:numPr>
+          <w:ilvl w:val="0"/>
+          <w:numId w:val="14"/>
+        </w:numPr>
+        <w:spacing w:after="60"/>
+      </w:pPr>
+      <w:r>
+        <w:rPr>
+          <w:rFonts w:ascii="Arial" w:cs="Arial" w:eastAsia="Arial" w:hAnsi="Arial"/>
+          <w:sz w:val="22"/>
+          <w:szCs w:val="22"/>
+        </w:rPr>
+        <w:t xml:space="preserve">Si el cliente pagó en línea con Wompi, el pedido ya aparece como </w:t>
+      </w:r>
+      <w:r>
+        <w:rPr>
+          <w:rFonts w:ascii="Arial" w:cs="Arial" w:eastAsia="Arial" w:hAnsi="Arial"/>
+          <w:b/>
+          <w:bCs/>
+          <w:sz w:val="22"/>
+          <w:szCs w:val="22"/>
+        </w:rPr>
+        <w:t xml:space="preserve">Facturado</w:t>
+      </w:r>
+      <w:r>
+        <w:rPr>
+          <w:rFonts w:ascii="Arial" w:cs="Arial" w:eastAsia="Arial" w:hAnsi="Arial"/>
+          <w:sz w:val="22"/>
+          <w:szCs w:val="22"/>
+        </w:rPr>
+        <w:t xml:space="preserve">; no debe cobrarse de nuevo.</w:t>
+      </w:r>
+    </w:p>
+    <w:p>
+      <w:pPr>
+        <w:spacing w:after="60"/>
+      </w:pPr>
+    </w:p>
+    <w:p>
+      <w:pPr>
+        <w:pBdr>
+          <w:left w:val="single" w:color="6B1E2E" w:sz="18" w:space="8"/>
+        </w:pBdr>
+        <w:shd w:fill="FBF6EE" w:color="auto" w:val="clear"/>
+        <w:spacing w:after="80"/>
+        <w:ind w:left="360"/>
+      </w:pPr>
+      <w:r>
+        <w:rPr>
+          <w:rFonts w:ascii="Arial" w:cs="Arial" w:eastAsia="Arial" w:hAnsi="Arial"/>
+          <w:b w:val="false"/>
+          <w:bCs w:val="false"/>
+          <w:sz w:val="22"/>
+          <w:szCs w:val="22"/>
+        </w:rPr>
+        <w:t xml:space="preserve">Los pagos reportados por un cliente mediante transferencia manual quedan </w:t>
+      </w:r>
+      <w:r>
+        <w:rPr>
+          <w:rFonts w:ascii="Arial" w:cs="Arial" w:eastAsia="Arial" w:hAnsi="Arial"/>
+          <w:b w:val="false"/>
+          <w:bCs w:val="false"/>
+          <w:sz w:val="22"/>
+          <w:szCs w:val="22"/>
+        </w:rPr>
+        <w:t xml:space="preserve">pendientes de verificación</w:t>
+      </w:r>
+      <w:r>
+        <w:rPr>
+          <w:rFonts w:ascii="Arial" w:cs="Arial" w:eastAsia="Arial" w:hAnsi="Arial"/>
+          <w:b w:val="false"/>
+          <w:bCs w:val="false"/>
+          <w:sz w:val="22"/>
+          <w:szCs w:val="22"/>
+        </w:rPr>
+        <w:t xml:space="preserve">: el cajero comprueba el comprobante antes de aprobarlos.</w:t>
+      </w:r>
+    </w:p>
+    <w:p>
+      <w:pPr>
+        <w:spacing w:after="120"/>
       </w:pPr>
     </w:p>
     <w:p>
@@ -6154,7 +5323,7 @@
           <w:sz w:val="22"/>
           <w:szCs w:val="22"/>
         </w:rPr>
-        <w:t xml:space="preserve">[Insertar captura: listado de facturas con filtros]</w:t>
+        <w:t xml:space="preserve">[Insertar captura: cobro en caja]</w:t>
       </w:r>
     </w:p>
     <w:p>
@@ -6173,139 +5342,40 @@
           <w:sz w:val="26"/>
           <w:szCs w:val="26"/>
         </w:rPr>
-        <w:t xml:space="preserve">7.3 Productos e inventario</w:t>
-      </w:r>
-    </w:p>
-    <w:p>
-      <w:pPr>
-        <w:pStyle w:val="ListParagraph"/>
-        <w:numPr>
-          <w:ilvl w:val="0"/>
-          <w:numId w:val="16"/>
-        </w:numPr>
-        <w:spacing w:after="60"/>
-      </w:pPr>
-      <w:r>
-        <w:rPr>
-          <w:rFonts w:ascii="Arial" w:cs="Arial" w:eastAsia="Arial" w:hAnsi="Arial"/>
-          <w:sz w:val="22"/>
-          <w:szCs w:val="22"/>
-        </w:rPr>
-        <w:t xml:space="preserve">Entre a </w:t>
-      </w:r>
-      <w:r>
-        <w:rPr>
-          <w:rFonts w:ascii="Arial" w:cs="Arial" w:eastAsia="Arial" w:hAnsi="Arial"/>
-          <w:b/>
-          <w:bCs/>
-          <w:sz w:val="22"/>
-          <w:szCs w:val="22"/>
-        </w:rPr>
-        <w:t xml:space="preserve">Productos</w:t>
-      </w:r>
-      <w:r>
-        <w:rPr>
-          <w:rFonts w:ascii="Arial" w:cs="Arial" w:eastAsia="Arial" w:hAnsi="Arial"/>
-          <w:sz w:val="22"/>
-          <w:szCs w:val="22"/>
-        </w:rPr>
-        <w:t xml:space="preserve">.</w:t>
-      </w:r>
-    </w:p>
-    <w:p>
-      <w:pPr>
-        <w:pStyle w:val="ListParagraph"/>
-        <w:numPr>
-          <w:ilvl w:val="0"/>
-          <w:numId w:val="16"/>
-        </w:numPr>
-        <w:spacing w:after="60"/>
-      </w:pPr>
-      <w:r>
-        <w:rPr>
-          <w:rFonts w:ascii="Arial" w:cs="Arial" w:eastAsia="Arial" w:hAnsi="Arial"/>
-          <w:sz w:val="22"/>
-          <w:szCs w:val="22"/>
-        </w:rPr>
-        <w:t xml:space="preserve">Pulse </w:t>
-      </w:r>
-      <w:r>
-        <w:rPr>
-          <w:rFonts w:ascii="Arial" w:cs="Arial" w:eastAsia="Arial" w:hAnsi="Arial"/>
-          <w:b/>
-          <w:bCs/>
-          <w:sz w:val="22"/>
-          <w:szCs w:val="22"/>
-        </w:rPr>
-        <w:t xml:space="preserve">Nuevo producto</w:t>
-      </w:r>
-      <w:r>
-        <w:rPr>
-          <w:rFonts w:ascii="Arial" w:cs="Arial" w:eastAsia="Arial" w:hAnsi="Arial"/>
-          <w:sz w:val="22"/>
-          <w:szCs w:val="22"/>
-        </w:rPr>
-        <w:t xml:space="preserve"> para registrar nombre, descripción, precio, existencias, categoría, ingredientes, alérgenos y si es vegetariano o libre de gluten.</w:t>
-      </w:r>
-    </w:p>
-    <w:p>
-      <w:pPr>
-        <w:pStyle w:val="ListParagraph"/>
-        <w:numPr>
-          <w:ilvl w:val="0"/>
-          <w:numId w:val="16"/>
-        </w:numPr>
-        <w:spacing w:after="60"/>
-      </w:pPr>
-      <w:r>
-        <w:rPr>
-          <w:rFonts w:ascii="Arial" w:cs="Arial" w:eastAsia="Arial" w:hAnsi="Arial"/>
-          <w:sz w:val="22"/>
-          <w:szCs w:val="22"/>
-        </w:rPr>
-        <w:t xml:space="preserve">Use </w:t>
-      </w:r>
-      <w:r>
-        <w:rPr>
-          <w:rFonts w:ascii="Arial" w:cs="Arial" w:eastAsia="Arial" w:hAnsi="Arial"/>
-          <w:b/>
-          <w:bCs/>
-          <w:sz w:val="22"/>
-          <w:szCs w:val="22"/>
-        </w:rPr>
-        <w:t xml:space="preserve">Editar</w:t>
-      </w:r>
-      <w:r>
-        <w:rPr>
-          <w:rFonts w:ascii="Arial" w:cs="Arial" w:eastAsia="Arial" w:hAnsi="Arial"/>
-          <w:sz w:val="22"/>
-          <w:szCs w:val="22"/>
-        </w:rPr>
-        <w:t xml:space="preserve"> para modificar datos o reponer el stock y </w:t>
-      </w:r>
-      <w:r>
-        <w:rPr>
-          <w:rFonts w:ascii="Arial" w:cs="Arial" w:eastAsia="Arial" w:hAnsi="Arial"/>
-          <w:b/>
-          <w:bCs/>
-          <w:sz w:val="22"/>
-          <w:szCs w:val="22"/>
-        </w:rPr>
-        <w:t xml:space="preserve">Desactivar</w:t>
-      </w:r>
-      <w:r>
-        <w:rPr>
-          <w:rFonts w:ascii="Arial" w:cs="Arial" w:eastAsia="Arial" w:hAnsi="Arial"/>
-          <w:sz w:val="22"/>
-          <w:szCs w:val="22"/>
-        </w:rPr>
-        <w:t xml:space="preserve"> para retirar un plato de la carta sin borrar su historial.</w:t>
-      </w:r>
-    </w:p>
-    <w:p>
-      <w:pPr>
-        <w:spacing w:after="60"/>
-      </w:pPr>
+        <w:t xml:space="preserve">6.3 Factura de venta directa</w:t>
+      </w:r>
+    </w:p>
+    <w:p>
+      <w:pPr>
+        <w:spacing w:after="120" w:line="300"/>
+        <w:jc w:val="left"/>
+      </w:pPr>
+      <w:r>
+        <w:rPr>
+          <w:rFonts w:ascii="Arial" w:cs="Arial" w:eastAsia="Arial" w:hAnsi="Arial"/>
+          <w:sz w:val="22"/>
+          <w:szCs w:val="22"/>
+        </w:rPr>
+        <w:t xml:space="preserve">En </w:t>
+      </w:r>
+      <w:r>
+        <w:rPr>
+          <w:rFonts w:ascii="Arial" w:cs="Arial" w:eastAsia="Arial" w:hAnsi="Arial"/>
+          <w:b/>
+          <w:bCs/>
+          <w:sz w:val="22"/>
+          <w:szCs w:val="22"/>
+        </w:rPr>
+        <w:t xml:space="preserve">Facturas ➜ Nueva</w:t>
+      </w:r>
+      <w:r>
+        <w:rPr>
+          <w:rFonts w:ascii="Arial" w:cs="Arial" w:eastAsia="Arial" w:hAnsi="Arial"/>
+          <w:sz w:val="22"/>
+          <w:szCs w:val="22"/>
+        </w:rPr>
+        <w:t xml:space="preserve"> puede registrar una venta sin pedido previo: seleccione los productos y cantidades, el cliente (o nombre libre) y el medio de pago.</w:t>
+      </w:r>
     </w:p>
     <w:p>
       <w:pPr>
@@ -6323,7 +5393,7 @@
           <w:sz w:val="26"/>
           <w:szCs w:val="26"/>
         </w:rPr>
-        <w:t xml:space="preserve">7.4 Proveedores</w:t>
+        <w:t xml:space="preserve">6.4 Anular una factura</w:t>
       </w:r>
     </w:p>
     <w:p>
@@ -6337,25 +5407,43 @@
           <w:sz w:val="22"/>
           <w:szCs w:val="22"/>
         </w:rPr>
-        <w:t xml:space="preserve">En </w:t>
-      </w:r>
-      <w:r>
-        <w:rPr>
-          <w:rFonts w:ascii="Arial" w:cs="Arial" w:eastAsia="Arial" w:hAnsi="Arial"/>
-          <w:b/>
-          <w:bCs/>
-          <w:sz w:val="22"/>
-          <w:szCs w:val="22"/>
-        </w:rPr>
-        <w:t xml:space="preserve">Proveedores</w:t>
-      </w:r>
-      <w:r>
-        <w:rPr>
-          <w:rFonts w:ascii="Arial" w:cs="Arial" w:eastAsia="Arial" w:hAnsi="Arial"/>
-          <w:sz w:val="22"/>
-          <w:szCs w:val="22"/>
-        </w:rPr>
-        <w:t xml:space="preserve"> registre nombre, NIT, contacto, teléfono, correo, dirección y categoría; edite o desactive proveedores.</w:t>
+        <w:t xml:space="preserve">Abra la factura en </w:t>
+      </w:r>
+      <w:r>
+        <w:rPr>
+          <w:rFonts w:ascii="Arial" w:cs="Arial" w:eastAsia="Arial" w:hAnsi="Arial"/>
+          <w:b/>
+          <w:bCs/>
+          <w:sz w:val="22"/>
+          <w:szCs w:val="22"/>
+        </w:rPr>
+        <w:t xml:space="preserve">Facturas</w:t>
+      </w:r>
+      <w:r>
+        <w:rPr>
+          <w:rFonts w:ascii="Arial" w:cs="Arial" w:eastAsia="Arial" w:hAnsi="Arial"/>
+          <w:sz w:val="22"/>
+          <w:szCs w:val="22"/>
+        </w:rPr>
+        <w:t xml:space="preserve"> y pulse </w:t>
+      </w:r>
+      <w:r>
+        <w:rPr>
+          <w:rFonts w:ascii="Arial" w:cs="Arial" w:eastAsia="Arial" w:hAnsi="Arial"/>
+          <w:b/>
+          <w:bCs/>
+          <w:sz w:val="22"/>
+          <w:szCs w:val="22"/>
+        </w:rPr>
+        <w:t xml:space="preserve">Anular</w:t>
+      </w:r>
+      <w:r>
+        <w:rPr>
+          <w:rFonts w:ascii="Arial" w:cs="Arial" w:eastAsia="Arial" w:hAnsi="Arial"/>
+          <w:sz w:val="22"/>
+          <w:szCs w:val="22"/>
+        </w:rPr>
+        <w:t xml:space="preserve">. La anulación queda registrada con el usuario que la realizó.</w:t>
       </w:r>
     </w:p>
     <w:p>
@@ -6374,8 +5462,193 @@
           <w:sz w:val="26"/>
           <w:szCs w:val="26"/>
         </w:rPr>
-        <w:t xml:space="preserve">7.5 Clientes</w:t>
-      </w:r>
+        <w:t xml:space="preserve">6.5 Cerrar el turno (arqueo)</w:t>
+      </w:r>
+    </w:p>
+    <w:p>
+      <w:pPr>
+        <w:pStyle w:val="ListParagraph"/>
+        <w:numPr>
+          <w:ilvl w:val="0"/>
+          <w:numId w:val="15"/>
+        </w:numPr>
+        <w:spacing w:after="60"/>
+      </w:pPr>
+      <w:r>
+        <w:rPr>
+          <w:rFonts w:ascii="Arial" w:cs="Arial" w:eastAsia="Arial" w:hAnsi="Arial"/>
+          <w:sz w:val="22"/>
+          <w:szCs w:val="22"/>
+        </w:rPr>
+        <w:t xml:space="preserve">Entre a </w:t>
+      </w:r>
+      <w:r>
+        <w:rPr>
+          <w:rFonts w:ascii="Arial" w:cs="Arial" w:eastAsia="Arial" w:hAnsi="Arial"/>
+          <w:b/>
+          <w:bCs/>
+          <w:sz w:val="22"/>
+          <w:szCs w:val="22"/>
+        </w:rPr>
+        <w:t xml:space="preserve">Caja</w:t>
+      </w:r>
+      <w:r>
+        <w:rPr>
+          <w:rFonts w:ascii="Arial" w:cs="Arial" w:eastAsia="Arial" w:hAnsi="Arial"/>
+          <w:sz w:val="22"/>
+          <w:szCs w:val="22"/>
+        </w:rPr>
+        <w:t xml:space="preserve">; el sistema muestra el </w:t>
+      </w:r>
+      <w:r>
+        <w:rPr>
+          <w:rFonts w:ascii="Arial" w:cs="Arial" w:eastAsia="Arial" w:hAnsi="Arial"/>
+          <w:b/>
+          <w:bCs/>
+          <w:sz w:val="22"/>
+          <w:szCs w:val="22"/>
+        </w:rPr>
+        <w:t xml:space="preserve">resumen en vivo</w:t>
+      </w:r>
+      <w:r>
+        <w:rPr>
+          <w:rFonts w:ascii="Arial" w:cs="Arial" w:eastAsia="Arial" w:hAnsi="Arial"/>
+          <w:sz w:val="22"/>
+          <w:szCs w:val="22"/>
+        </w:rPr>
+        <w:t xml:space="preserve"> del turno (ventas por medio de pago).</w:t>
+      </w:r>
+    </w:p>
+    <w:p>
+      <w:pPr>
+        <w:pStyle w:val="ListParagraph"/>
+        <w:numPr>
+          <w:ilvl w:val="0"/>
+          <w:numId w:val="15"/>
+        </w:numPr>
+        <w:spacing w:after="60"/>
+      </w:pPr>
+      <w:r>
+        <w:rPr>
+          <w:rFonts w:ascii="Arial" w:cs="Arial" w:eastAsia="Arial" w:hAnsi="Arial"/>
+          <w:sz w:val="22"/>
+          <w:szCs w:val="22"/>
+        </w:rPr>
+        <w:t xml:space="preserve">Cuente el efectivo y escríbalo en </w:t>
+      </w:r>
+      <w:r>
+        <w:rPr>
+          <w:rFonts w:ascii="Arial" w:cs="Arial" w:eastAsia="Arial" w:hAnsi="Arial"/>
+          <w:b/>
+          <w:bCs/>
+          <w:sz w:val="22"/>
+          <w:szCs w:val="22"/>
+        </w:rPr>
+        <w:t xml:space="preserve">Efectivo declarado</w:t>
+      </w:r>
+      <w:r>
+        <w:rPr>
+          <w:rFonts w:ascii="Arial" w:cs="Arial" w:eastAsia="Arial" w:hAnsi="Arial"/>
+          <w:sz w:val="22"/>
+          <w:szCs w:val="22"/>
+        </w:rPr>
+        <w:t xml:space="preserve">.</w:t>
+      </w:r>
+    </w:p>
+    <w:p>
+      <w:pPr>
+        <w:pStyle w:val="ListParagraph"/>
+        <w:numPr>
+          <w:ilvl w:val="0"/>
+          <w:numId w:val="15"/>
+        </w:numPr>
+        <w:spacing w:after="60"/>
+      </w:pPr>
+      <w:r>
+        <w:rPr>
+          <w:rFonts w:ascii="Arial" w:cs="Arial" w:eastAsia="Arial" w:hAnsi="Arial"/>
+          <w:sz w:val="22"/>
+          <w:szCs w:val="22"/>
+        </w:rPr>
+        <w:t xml:space="preserve">Pulse </w:t>
+      </w:r>
+      <w:r>
+        <w:rPr>
+          <w:rFonts w:ascii="Arial" w:cs="Arial" w:eastAsia="Arial" w:hAnsi="Arial"/>
+          <w:b/>
+          <w:bCs/>
+          <w:sz w:val="22"/>
+          <w:szCs w:val="22"/>
+        </w:rPr>
+        <w:t xml:space="preserve">Realizar Arqueo &amp; Cerrar Turno</w:t>
+      </w:r>
+      <w:r>
+        <w:rPr>
+          <w:rFonts w:ascii="Arial" w:cs="Arial" w:eastAsia="Arial" w:hAnsi="Arial"/>
+          <w:sz w:val="22"/>
+          <w:szCs w:val="22"/>
+        </w:rPr>
+        <w:t xml:space="preserve">. El sistema calcula la </w:t>
+      </w:r>
+      <w:r>
+        <w:rPr>
+          <w:rFonts w:ascii="Arial" w:cs="Arial" w:eastAsia="Arial" w:hAnsi="Arial"/>
+          <w:b/>
+          <w:bCs/>
+          <w:sz w:val="22"/>
+          <w:szCs w:val="22"/>
+        </w:rPr>
+        <w:t xml:space="preserve">diferencia</w:t>
+      </w:r>
+      <w:r>
+        <w:rPr>
+          <w:rFonts w:ascii="Arial" w:cs="Arial" w:eastAsia="Arial" w:hAnsi="Arial"/>
+          <w:sz w:val="22"/>
+          <w:szCs w:val="22"/>
+        </w:rPr>
+        <w:t xml:space="preserve"> entre el efectivo esperado y el declarado.</w:t>
+      </w:r>
+    </w:p>
+    <w:p>
+      <w:pPr>
+        <w:pStyle w:val="ListParagraph"/>
+        <w:numPr>
+          <w:ilvl w:val="0"/>
+          <w:numId w:val="15"/>
+        </w:numPr>
+        <w:spacing w:after="60"/>
+      </w:pPr>
+      <w:r>
+        <w:rPr>
+          <w:rFonts w:ascii="Arial" w:cs="Arial" w:eastAsia="Arial" w:hAnsi="Arial"/>
+          <w:sz w:val="22"/>
+          <w:szCs w:val="22"/>
+        </w:rPr>
+        <w:t xml:space="preserve">El turno queda en el </w:t>
+      </w:r>
+      <w:r>
+        <w:rPr>
+          <w:rFonts w:ascii="Arial" w:cs="Arial" w:eastAsia="Arial" w:hAnsi="Arial"/>
+          <w:b/>
+          <w:bCs/>
+          <w:sz w:val="22"/>
+          <w:szCs w:val="22"/>
+        </w:rPr>
+        <w:t xml:space="preserve">historial de turnos y arqueos</w:t>
+      </w:r>
+      <w:r>
+        <w:rPr>
+          <w:rFonts w:ascii="Arial" w:cs="Arial" w:eastAsia="Arial" w:hAnsi="Arial"/>
+          <w:sz w:val="22"/>
+          <w:szCs w:val="22"/>
+        </w:rPr>
+        <w:t xml:space="preserve">.</w:t>
+      </w:r>
+    </w:p>
+    <w:p>
+      <w:pPr>
+        <w:spacing w:after="60"/>
+      </w:pPr>
     </w:p>
     <w:p>
       <w:pPr>
@@ -6385,499 +5658,12 @@
       <w:r>
         <w:rPr>
           <w:rFonts w:ascii="Arial" w:cs="Arial" w:eastAsia="Arial" w:hAnsi="Arial"/>
-          <w:sz w:val="22"/>
-          <w:szCs w:val="22"/>
-        </w:rPr>
-        <w:t xml:space="preserve">En </w:t>
-      </w:r>
-      <w:r>
-        <w:rPr>
-          <w:rFonts w:ascii="Arial" w:cs="Arial" w:eastAsia="Arial" w:hAnsi="Arial"/>
-          <w:b/>
-          <w:bCs/>
-          <w:sz w:val="22"/>
-          <w:szCs w:val="22"/>
-        </w:rPr>
-        <w:t xml:space="preserve">Clientes</w:t>
-      </w:r>
-      <w:r>
-        <w:rPr>
-          <w:rFonts w:ascii="Arial" w:cs="Arial" w:eastAsia="Arial" w:hAnsi="Arial"/>
-          <w:sz w:val="22"/>
-          <w:szCs w:val="22"/>
-        </w:rPr>
-        <w:t xml:space="preserve"> consulte y edite los datos de los comensales registrados (documento, teléfono, correo, dirección, fecha de nacimiento).</w:t>
-      </w:r>
-    </w:p>
-    <w:p>
-      <w:pPr>
-        <w:pStyle w:val="Heading3"/>
-        <w:keepNext/>
-        <w:spacing w:after="120" w:before="280"/>
-        <w:jc w:val="left"/>
-      </w:pPr>
-      <w:r>
-        <w:rPr>
-          <w:rFonts w:ascii="Arial" w:cs="Arial" w:eastAsia="Arial" w:hAnsi="Arial"/>
-          <w:b/>
-          <w:bCs/>
-          <w:color w:val="3A2B32"/>
-          <w:sz w:val="26"/>
-          <w:szCs w:val="26"/>
-        </w:rPr>
-        <w:t xml:space="preserve">7.6 Cupones de descuento</w:t>
-      </w:r>
-    </w:p>
-    <w:p>
-      <w:pPr>
-        <w:pStyle w:val="ListParagraph"/>
-        <w:numPr>
-          <w:ilvl w:val="0"/>
-          <w:numId w:val="17"/>
-        </w:numPr>
-        <w:spacing w:after="60"/>
-      </w:pPr>
-      <w:r>
-        <w:rPr>
-          <w:rFonts w:ascii="Arial" w:cs="Arial" w:eastAsia="Arial" w:hAnsi="Arial"/>
-          <w:sz w:val="22"/>
-          <w:szCs w:val="22"/>
-        </w:rPr>
-        <w:t xml:space="preserve">Entre a </w:t>
-      </w:r>
-      <w:r>
-        <w:rPr>
-          <w:rFonts w:ascii="Arial" w:cs="Arial" w:eastAsia="Arial" w:hAnsi="Arial"/>
-          <w:b/>
-          <w:bCs/>
-          <w:sz w:val="22"/>
-          <w:szCs w:val="22"/>
-        </w:rPr>
-        <w:t xml:space="preserve">Cupones ➜ Nuevo</w:t>
-      </w:r>
-      <w:r>
-        <w:rPr>
-          <w:rFonts w:ascii="Arial" w:cs="Arial" w:eastAsia="Arial" w:hAnsi="Arial"/>
-          <w:sz w:val="22"/>
-          <w:szCs w:val="22"/>
-        </w:rPr>
-        <w:t xml:space="preserve">.</w:t>
-      </w:r>
-    </w:p>
-    <w:p>
-      <w:pPr>
-        <w:pStyle w:val="ListParagraph"/>
-        <w:numPr>
-          <w:ilvl w:val="0"/>
-          <w:numId w:val="17"/>
-        </w:numPr>
-        <w:spacing w:after="60"/>
-      </w:pPr>
-      <w:r>
-        <w:rPr>
-          <w:rFonts w:ascii="Arial" w:cs="Arial" w:eastAsia="Arial" w:hAnsi="Arial"/>
-          <w:sz w:val="22"/>
-          <w:szCs w:val="22"/>
-        </w:rPr>
-        <w:t xml:space="preserve">Defina el </w:t>
-      </w:r>
-      <w:r>
-        <w:rPr>
-          <w:rFonts w:ascii="Arial" w:cs="Arial" w:eastAsia="Arial" w:hAnsi="Arial"/>
-          <w:b/>
-          <w:bCs/>
-          <w:sz w:val="22"/>
-          <w:szCs w:val="22"/>
-        </w:rPr>
-        <w:t xml:space="preserve">código</w:t>
-      </w:r>
-      <w:r>
-        <w:rPr>
-          <w:rFonts w:ascii="Arial" w:cs="Arial" w:eastAsia="Arial" w:hAnsi="Arial"/>
-          <w:sz w:val="22"/>
-          <w:szCs w:val="22"/>
-        </w:rPr>
-        <w:t xml:space="preserve">, el tipo de descuento (porcentaje o valor fijo), el valor, el monto mínimo de compra, el tope máximo, la fecha de vencimiento y el número máximo de usos.</w:t>
-      </w:r>
-    </w:p>
-    <w:p>
-      <w:pPr>
-        <w:pStyle w:val="ListParagraph"/>
-        <w:numPr>
-          <w:ilvl w:val="0"/>
-          <w:numId w:val="17"/>
-        </w:numPr>
-        <w:spacing w:after="60"/>
-      </w:pPr>
-      <w:r>
-        <w:rPr>
-          <w:rFonts w:ascii="Arial" w:cs="Arial" w:eastAsia="Arial" w:hAnsi="Arial"/>
-          <w:sz w:val="22"/>
-          <w:szCs w:val="22"/>
-        </w:rPr>
-        <w:t xml:space="preserve">Active o desactive un cupón con </w:t>
-      </w:r>
-      <w:r>
-        <w:rPr>
-          <w:rFonts w:ascii="Arial" w:cs="Arial" w:eastAsia="Arial" w:hAnsi="Arial"/>
-          <w:b/>
-          <w:bCs/>
-          <w:sz w:val="22"/>
-          <w:szCs w:val="22"/>
-        </w:rPr>
-        <w:t xml:space="preserve">Activar/Desactivar</w:t>
-      </w:r>
-      <w:r>
-        <w:rPr>
-          <w:rFonts w:ascii="Arial" w:cs="Arial" w:eastAsia="Arial" w:hAnsi="Arial"/>
-          <w:sz w:val="22"/>
-          <w:szCs w:val="22"/>
-        </w:rPr>
-        <w:t xml:space="preserve">.</w:t>
-      </w:r>
-    </w:p>
-    <w:p>
-      <w:pPr>
-        <w:spacing w:after="60"/>
-      </w:pPr>
-    </w:p>
-    <w:p>
-      <w:pPr>
-        <w:pStyle w:val="Heading3"/>
-        <w:keepNext/>
-        <w:spacing w:after="120" w:before="280"/>
-        <w:jc w:val="left"/>
-      </w:pPr>
-      <w:r>
-        <w:rPr>
-          <w:rFonts w:ascii="Arial" w:cs="Arial" w:eastAsia="Arial" w:hAnsi="Arial"/>
-          <w:b/>
-          <w:bCs/>
-          <w:color w:val="3A2B32"/>
-          <w:sz w:val="26"/>
-          <w:szCs w:val="26"/>
-        </w:rPr>
-        <w:t xml:space="preserve">7.7 Personal (usuarios del sistema)</w:t>
-      </w:r>
-    </w:p>
-    <w:p>
-      <w:pPr>
-        <w:pStyle w:val="ListParagraph"/>
-        <w:numPr>
-          <w:ilvl w:val="0"/>
-          <w:numId w:val="18"/>
-        </w:numPr>
-        <w:spacing w:after="60"/>
-      </w:pPr>
-      <w:r>
-        <w:rPr>
-          <w:rFonts w:ascii="Arial" w:cs="Arial" w:eastAsia="Arial" w:hAnsi="Arial"/>
-          <w:sz w:val="22"/>
-          <w:szCs w:val="22"/>
-        </w:rPr>
-        <w:t xml:space="preserve">Entre a </w:t>
-      </w:r>
-      <w:r>
-        <w:rPr>
-          <w:rFonts w:ascii="Arial" w:cs="Arial" w:eastAsia="Arial" w:hAnsi="Arial"/>
-          <w:b/>
-          <w:bCs/>
-          <w:sz w:val="22"/>
-          <w:szCs w:val="22"/>
-        </w:rPr>
-        <w:t xml:space="preserve">Personal ➜ Crear</w:t>
-      </w:r>
-      <w:r>
-        <w:rPr>
-          <w:rFonts w:ascii="Arial" w:cs="Arial" w:eastAsia="Arial" w:hAnsi="Arial"/>
-          <w:sz w:val="22"/>
-          <w:szCs w:val="22"/>
-        </w:rPr>
-        <w:t xml:space="preserve">.</w:t>
-      </w:r>
-    </w:p>
-    <w:p>
-      <w:pPr>
-        <w:pStyle w:val="ListParagraph"/>
-        <w:numPr>
-          <w:ilvl w:val="0"/>
-          <w:numId w:val="18"/>
-        </w:numPr>
-        <w:spacing w:after="60"/>
-      </w:pPr>
-      <w:r>
-        <w:rPr>
-          <w:rFonts w:ascii="Arial" w:cs="Arial" w:eastAsia="Arial" w:hAnsi="Arial"/>
-          <w:sz w:val="22"/>
-          <w:szCs w:val="22"/>
-        </w:rPr>
-        <w:t xml:space="preserve">Escriba el usuario, el correo y elija el </w:t>
-      </w:r>
-      <w:r>
-        <w:rPr>
-          <w:rFonts w:ascii="Arial" w:cs="Arial" w:eastAsia="Arial" w:hAnsi="Arial"/>
-          <w:b/>
-          <w:bCs/>
-          <w:sz w:val="22"/>
-          <w:szCs w:val="22"/>
-        </w:rPr>
-        <w:t xml:space="preserve">rol</w:t>
-      </w:r>
-      <w:r>
-        <w:rPr>
-          <w:rFonts w:ascii="Arial" w:cs="Arial" w:eastAsia="Arial" w:hAnsi="Arial"/>
-          <w:sz w:val="22"/>
-          <w:szCs w:val="22"/>
-        </w:rPr>
-        <w:t xml:space="preserve"> (Mesero, Cocinero, Cajero, Domiciliario o Administrador).</w:t>
-      </w:r>
-    </w:p>
-    <w:p>
-      <w:pPr>
-        <w:pStyle w:val="ListParagraph"/>
-        <w:numPr>
-          <w:ilvl w:val="0"/>
-          <w:numId w:val="18"/>
-        </w:numPr>
-        <w:spacing w:after="60"/>
-      </w:pPr>
-      <w:r>
-        <w:rPr>
-          <w:rFonts w:ascii="Arial" w:cs="Arial" w:eastAsia="Arial" w:hAnsi="Arial"/>
-          <w:sz w:val="22"/>
-          <w:szCs w:val="22"/>
-        </w:rPr>
-        <w:t xml:space="preserve">El sistema genera una contraseña temporal; el empleado deberá cambiarla en su primer ingreso.</w:t>
-      </w:r>
-    </w:p>
-    <w:p>
-      <w:pPr>
-        <w:pStyle w:val="ListParagraph"/>
-        <w:numPr>
-          <w:ilvl w:val="0"/>
-          <w:numId w:val="18"/>
-        </w:numPr>
-        <w:spacing w:after="60"/>
-      </w:pPr>
-      <w:r>
-        <w:rPr>
-          <w:rFonts w:ascii="Arial" w:cs="Arial" w:eastAsia="Arial" w:hAnsi="Arial"/>
-          <w:sz w:val="22"/>
-          <w:szCs w:val="22"/>
-        </w:rPr>
-        <w:t xml:space="preserve">Desde la misma pantalla puede </w:t>
-      </w:r>
-      <w:r>
-        <w:rPr>
-          <w:rFonts w:ascii="Arial" w:cs="Arial" w:eastAsia="Arial" w:hAnsi="Arial"/>
-          <w:b/>
-          <w:bCs/>
-          <w:sz w:val="22"/>
-          <w:szCs w:val="22"/>
-        </w:rPr>
-        <w:t xml:space="preserve">cambiar el rol</w:t>
-      </w:r>
-      <w:r>
-        <w:rPr>
-          <w:rFonts w:ascii="Arial" w:cs="Arial" w:eastAsia="Arial" w:hAnsi="Arial"/>
-          <w:sz w:val="22"/>
-          <w:szCs w:val="22"/>
-        </w:rPr>
-        <w:t xml:space="preserve">, </w:t>
-      </w:r>
-      <w:r>
-        <w:rPr>
-          <w:rFonts w:ascii="Arial" w:cs="Arial" w:eastAsia="Arial" w:hAnsi="Arial"/>
-          <w:b/>
-          <w:bCs/>
-          <w:sz w:val="22"/>
-          <w:szCs w:val="22"/>
-        </w:rPr>
-        <w:t xml:space="preserve">activar o desactivar</w:t>
-      </w:r>
-      <w:r>
-        <w:rPr>
-          <w:rFonts w:ascii="Arial" w:cs="Arial" w:eastAsia="Arial" w:hAnsi="Arial"/>
-          <w:sz w:val="22"/>
-          <w:szCs w:val="22"/>
-        </w:rPr>
-        <w:t xml:space="preserve"> una cuenta y </w:t>
-      </w:r>
-      <w:r>
-        <w:rPr>
-          <w:rFonts w:ascii="Arial" w:cs="Arial" w:eastAsia="Arial" w:hAnsi="Arial"/>
-          <w:b/>
-          <w:bCs/>
-          <w:sz w:val="22"/>
-          <w:szCs w:val="22"/>
-        </w:rPr>
-        <w:t xml:space="preserve">restablecer la contraseña</w:t>
-      </w:r>
-      <w:r>
-        <w:rPr>
-          <w:rFonts w:ascii="Arial" w:cs="Arial" w:eastAsia="Arial" w:hAnsi="Arial"/>
-          <w:sz w:val="22"/>
-          <w:szCs w:val="22"/>
-        </w:rPr>
-        <w:t xml:space="preserve">.</w:t>
-      </w:r>
-    </w:p>
-    <w:p>
-      <w:pPr>
-        <w:spacing w:after="60"/>
-      </w:pPr>
-    </w:p>
-    <w:p>
-      <w:pPr>
-        <w:pStyle w:val="Heading3"/>
-        <w:keepNext/>
-        <w:spacing w:after="120" w:before="280"/>
-        <w:jc w:val="left"/>
-      </w:pPr>
-      <w:r>
-        <w:rPr>
-          <w:rFonts w:ascii="Arial" w:cs="Arial" w:eastAsia="Arial" w:hAnsi="Arial"/>
-          <w:b/>
-          <w:bCs/>
-          <w:color w:val="3A2B32"/>
-          <w:sz w:val="26"/>
-          <w:szCs w:val="26"/>
-        </w:rPr>
-        <w:t xml:space="preserve">7.8 Reservas</w:t>
-      </w:r>
-    </w:p>
-    <w:p>
-      <w:pPr>
-        <w:spacing w:after="120" w:line="300"/>
-        <w:jc w:val="left"/>
-      </w:pPr>
-      <w:r>
-        <w:rPr>
-          <w:rFonts w:ascii="Arial" w:cs="Arial" w:eastAsia="Arial" w:hAnsi="Arial"/>
-          <w:sz w:val="22"/>
-          <w:szCs w:val="22"/>
-        </w:rPr>
-        <w:t xml:space="preserve">En </w:t>
-      </w:r>
-      <w:r>
-        <w:rPr>
-          <w:rFonts w:ascii="Arial" w:cs="Arial" w:eastAsia="Arial" w:hAnsi="Arial"/>
-          <w:b/>
-          <w:bCs/>
-          <w:sz w:val="22"/>
-          <w:szCs w:val="22"/>
-        </w:rPr>
-        <w:t xml:space="preserve">Reservas (administración)</w:t>
-      </w:r>
-      <w:r>
-        <w:rPr>
-          <w:rFonts w:ascii="Arial" w:cs="Arial" w:eastAsia="Arial" w:hAnsi="Arial"/>
-          <w:sz w:val="22"/>
-          <w:szCs w:val="22"/>
-        </w:rPr>
-        <w:t xml:space="preserve"> vea las reservas por día, cambie su estado (confirmada, completada, cancelada) y consulte los avisos recientes.</w:t>
-      </w:r>
-    </w:p>
-    <w:p>
-      <w:pPr>
-        <w:pStyle w:val="Heading3"/>
-        <w:keepNext/>
-        <w:spacing w:after="120" w:before="280"/>
-        <w:jc w:val="left"/>
-      </w:pPr>
-      <w:r>
-        <w:rPr>
-          <w:rFonts w:ascii="Arial" w:cs="Arial" w:eastAsia="Arial" w:hAnsi="Arial"/>
-          <w:b/>
-          <w:bCs/>
-          <w:color w:val="3A2B32"/>
-          <w:sz w:val="26"/>
-          <w:szCs w:val="26"/>
-        </w:rPr>
-        <w:t xml:space="preserve">7.9 Domicilios</w:t>
-      </w:r>
-    </w:p>
-    <w:p>
-      <w:pPr>
-        <w:spacing w:after="120" w:line="300"/>
-        <w:jc w:val="left"/>
-      </w:pPr>
-      <w:r>
-        <w:rPr>
-          <w:rFonts w:ascii="Arial" w:cs="Arial" w:eastAsia="Arial" w:hAnsi="Arial"/>
-          <w:sz w:val="22"/>
-          <w:szCs w:val="22"/>
-        </w:rPr>
-        <w:t xml:space="preserve">En </w:t>
-      </w:r>
-      <w:r>
-        <w:rPr>
-          <w:rFonts w:ascii="Arial" w:cs="Arial" w:eastAsia="Arial" w:hAnsi="Arial"/>
-          <w:b/>
-          <w:bCs/>
-          <w:sz w:val="22"/>
-          <w:szCs w:val="22"/>
-        </w:rPr>
-        <w:t xml:space="preserve">Domicilios</w:t>
-      </w:r>
-      <w:r>
-        <w:rPr>
-          <w:rFonts w:ascii="Arial" w:cs="Arial" w:eastAsia="Arial" w:hAnsi="Arial"/>
-          <w:sz w:val="22"/>
-          <w:szCs w:val="22"/>
-        </w:rPr>
-        <w:t xml:space="preserve"> el administrador ajusta el valor del envío de un pedido, asigna el repartidor y actualiza el estado del domicilio.</w:t>
-      </w:r>
-    </w:p>
-    <w:p>
-      <w:pPr>
-        <w:pStyle w:val="Heading3"/>
-        <w:keepNext/>
-        <w:spacing w:after="120" w:before="280"/>
-        <w:jc w:val="left"/>
-      </w:pPr>
-      <w:r>
-        <w:rPr>
-          <w:rFonts w:ascii="Arial" w:cs="Arial" w:eastAsia="Arial" w:hAnsi="Arial"/>
-          <w:b/>
-          <w:bCs/>
-          <w:color w:val="3A2B32"/>
-          <w:sz w:val="26"/>
-          <w:szCs w:val="26"/>
-        </w:rPr>
-        <w:t xml:space="preserve">7.10 Reseñas</w:t>
-      </w:r>
-    </w:p>
-    <w:p>
-      <w:pPr>
-        <w:spacing w:after="120" w:line="300"/>
-        <w:jc w:val="left"/>
-      </w:pPr>
-      <w:r>
-        <w:rPr>
-          <w:rFonts w:ascii="Arial" w:cs="Arial" w:eastAsia="Arial" w:hAnsi="Arial"/>
-          <w:sz w:val="22"/>
-          <w:szCs w:val="22"/>
-        </w:rPr>
-        <w:t xml:space="preserve">En </w:t>
-      </w:r>
-      <w:r>
-        <w:rPr>
-          <w:rFonts w:ascii="Arial" w:cs="Arial" w:eastAsia="Arial" w:hAnsi="Arial"/>
-          <w:b/>
-          <w:bCs/>
-          <w:sz w:val="22"/>
-          <w:szCs w:val="22"/>
-        </w:rPr>
-        <w:t xml:space="preserve">Reseñas</w:t>
-      </w:r>
-      <w:r>
-        <w:rPr>
-          <w:rFonts w:ascii="Arial" w:cs="Arial" w:eastAsia="Arial" w:hAnsi="Arial"/>
-          <w:sz w:val="22"/>
-          <w:szCs w:val="22"/>
-        </w:rPr>
-        <w:t xml:space="preserve"> apruebe, oculte o elimine los comentarios de los clientes antes de que se publiquen en la página de inicio.</w:t>
+          <w:b/>
+          <w:bCs/>
+          <w:sz w:val="22"/>
+          <w:szCs w:val="22"/>
+        </w:rPr>
+        <w:t xml:space="preserve">[Insertar captura: arqueo y cierre de turno]</w:t>
       </w:r>
     </w:p>
     <w:p>
@@ -6905,7 +5691,7 @@
           <w:sz w:val="30"/>
           <w:szCs w:val="30"/>
         </w:rPr>
-        <w:t xml:space="preserve">8. Rol Domiciliario (complemento)</w:t>
+        <w:t xml:space="preserve">7. Rol Administrador</w:t>
       </w:r>
     </w:p>
     <w:p>
@@ -6939,6 +5725,1289 @@
           <w:sz w:val="22"/>
           <w:szCs w:val="22"/>
         </w:rPr>
+        <w:t xml:space="preserve">Panel de indicadores</w:t>
+      </w:r>
+      <w:r>
+        <w:rPr>
+          <w:rFonts w:ascii="Arial" w:cs="Arial" w:eastAsia="Arial" w:hAnsi="Arial"/>
+          <w:sz w:val="22"/>
+          <w:szCs w:val="22"/>
+        </w:rPr>
+        <w:t xml:space="preserve">. El administrador accede a todos los módulos.</w:t>
+      </w:r>
+    </w:p>
+    <w:p>
+      <w:pPr>
+        <w:pStyle w:val="Heading3"/>
+        <w:keepNext/>
+        <w:spacing w:after="120" w:before="280"/>
+        <w:jc w:val="left"/>
+      </w:pPr>
+      <w:r>
+        <w:rPr>
+          <w:rFonts w:ascii="Arial" w:cs="Arial" w:eastAsia="Arial" w:hAnsi="Arial"/>
+          <w:b/>
+          <w:bCs/>
+          <w:color w:val="3A2B32"/>
+          <w:sz w:val="26"/>
+          <w:szCs w:val="26"/>
+        </w:rPr>
+        <w:t xml:space="preserve">7.1 Panel de indicadores</w:t>
+      </w:r>
+    </w:p>
+    <w:p>
+      <w:pPr>
+        <w:spacing w:after="120" w:line="300"/>
+        <w:jc w:val="left"/>
+      </w:pPr>
+      <w:r>
+        <w:rPr>
+          <w:rFonts w:ascii="Arial" w:cs="Arial" w:eastAsia="Arial" w:hAnsi="Arial"/>
+          <w:sz w:val="22"/>
+          <w:szCs w:val="22"/>
+        </w:rPr>
+        <w:t xml:space="preserve">Al ingresar se muestra la </w:t>
+      </w:r>
+      <w:r>
+        <w:rPr>
+          <w:rFonts w:ascii="Arial" w:cs="Arial" w:eastAsia="Arial" w:hAnsi="Arial"/>
+          <w:b/>
+          <w:bCs/>
+          <w:sz w:val="22"/>
+          <w:szCs w:val="22"/>
+        </w:rPr>
+        <w:t xml:space="preserve">Operación de hoy</w:t>
+      </w:r>
+      <w:r>
+        <w:rPr>
+          <w:rFonts w:ascii="Arial" w:cs="Arial" w:eastAsia="Arial" w:hAnsi="Arial"/>
+          <w:sz w:val="22"/>
+          <w:szCs w:val="22"/>
+        </w:rPr>
+        <w:t xml:space="preserve">:</w:t>
+      </w:r>
+    </w:p>
+    <w:p>
+      <w:pPr>
+        <w:pStyle w:val="ListParagraph"/>
+        <w:numPr>
+          <w:ilvl w:val="0"/>
+          <w:numId w:val="3"/>
+        </w:numPr>
+        <w:spacing w:after="60"/>
+      </w:pPr>
+      <w:r>
+        <w:rPr>
+          <w:rFonts w:ascii="Arial" w:cs="Arial" w:eastAsia="Arial" w:hAnsi="Arial"/>
+          <w:b/>
+          <w:bCs/>
+          <w:sz w:val="22"/>
+          <w:szCs w:val="22"/>
+        </w:rPr>
+        <w:t xml:space="preserve">Ventas del día</w:t>
+      </w:r>
+      <w:r>
+        <w:rPr>
+          <w:rFonts w:ascii="Arial" w:cs="Arial" w:eastAsia="Arial" w:hAnsi="Arial"/>
+          <w:sz w:val="22"/>
+          <w:szCs w:val="22"/>
+        </w:rPr>
+        <w:t xml:space="preserve"> y su comparación con el promedio diario de los siete días anteriores.</w:t>
+      </w:r>
+    </w:p>
+    <w:p>
+      <w:pPr>
+        <w:pStyle w:val="ListParagraph"/>
+        <w:numPr>
+          <w:ilvl w:val="0"/>
+          <w:numId w:val="3"/>
+        </w:numPr>
+        <w:spacing w:after="60"/>
+      </w:pPr>
+      <w:r>
+        <w:rPr>
+          <w:rFonts w:ascii="Arial" w:cs="Arial" w:eastAsia="Arial" w:hAnsi="Arial"/>
+          <w:b/>
+          <w:bCs/>
+          <w:sz w:val="22"/>
+          <w:szCs w:val="22"/>
+        </w:rPr>
+        <w:t xml:space="preserve">Pedidos activos</w:t>
+      </w:r>
+      <w:r>
+        <w:rPr>
+          <w:rFonts w:ascii="Arial" w:cs="Arial" w:eastAsia="Arial" w:hAnsi="Arial"/>
+          <w:sz w:val="22"/>
+          <w:szCs w:val="22"/>
+        </w:rPr>
+        <w:t xml:space="preserve"> y domicilios en ruta.</w:t>
+      </w:r>
+    </w:p>
+    <w:p>
+      <w:pPr>
+        <w:pStyle w:val="ListParagraph"/>
+        <w:numPr>
+          <w:ilvl w:val="0"/>
+          <w:numId w:val="3"/>
+        </w:numPr>
+        <w:spacing w:after="60"/>
+      </w:pPr>
+      <w:r>
+        <w:rPr>
+          <w:rFonts w:ascii="Arial" w:cs="Arial" w:eastAsia="Arial" w:hAnsi="Arial"/>
+          <w:b/>
+          <w:bCs/>
+          <w:sz w:val="22"/>
+          <w:szCs w:val="22"/>
+        </w:rPr>
+        <w:t xml:space="preserve">Ocupación del salón</w:t>
+      </w:r>
+      <w:r>
+        <w:rPr>
+          <w:rFonts w:ascii="Arial" w:cs="Arial" w:eastAsia="Arial" w:hAnsi="Arial"/>
+          <w:sz w:val="22"/>
+          <w:szCs w:val="22"/>
+        </w:rPr>
+        <w:t xml:space="preserve"> (mesas ocupadas frente al total).</w:t>
+      </w:r>
+    </w:p>
+    <w:p>
+      <w:pPr>
+        <w:pStyle w:val="ListParagraph"/>
+        <w:numPr>
+          <w:ilvl w:val="0"/>
+          <w:numId w:val="3"/>
+        </w:numPr>
+        <w:spacing w:after="60"/>
+      </w:pPr>
+      <w:r>
+        <w:rPr>
+          <w:rFonts w:ascii="Arial" w:cs="Arial" w:eastAsia="Arial" w:hAnsi="Arial"/>
+          <w:b/>
+          <w:bCs/>
+          <w:sz w:val="22"/>
+          <w:szCs w:val="22"/>
+        </w:rPr>
+        <w:t xml:space="preserve">Reservas del día</w:t>
+      </w:r>
+      <w:r>
+        <w:rPr>
+          <w:rFonts w:ascii="Arial" w:cs="Arial" w:eastAsia="Arial" w:hAnsi="Arial"/>
+          <w:sz w:val="22"/>
+          <w:szCs w:val="22"/>
+        </w:rPr>
+        <w:t xml:space="preserve"> y próximas reservas.</w:t>
+      </w:r>
+    </w:p>
+    <w:p>
+      <w:pPr>
+        <w:pStyle w:val="ListParagraph"/>
+        <w:numPr>
+          <w:ilvl w:val="0"/>
+          <w:numId w:val="3"/>
+        </w:numPr>
+        <w:spacing w:after="60"/>
+      </w:pPr>
+      <w:r>
+        <w:rPr>
+          <w:rFonts w:ascii="Arial" w:cs="Arial" w:eastAsia="Arial" w:hAnsi="Arial"/>
+          <w:b/>
+          <w:bCs/>
+          <w:sz w:val="22"/>
+          <w:szCs w:val="22"/>
+        </w:rPr>
+        <w:t xml:space="preserve">Alertas de inventario</w:t>
+      </w:r>
+      <w:r>
+        <w:rPr>
+          <w:rFonts w:ascii="Arial" w:cs="Arial" w:eastAsia="Arial" w:hAnsi="Arial"/>
+          <w:sz w:val="22"/>
+          <w:szCs w:val="22"/>
+        </w:rPr>
+        <w:t xml:space="preserve"> (productos con stock crítico).</w:t>
+      </w:r>
+    </w:p>
+    <w:p>
+      <w:pPr>
+        <w:pStyle w:val="ListParagraph"/>
+        <w:numPr>
+          <w:ilvl w:val="0"/>
+          <w:numId w:val="3"/>
+        </w:numPr>
+        <w:spacing w:after="60"/>
+      </w:pPr>
+      <w:r>
+        <w:rPr>
+          <w:rFonts w:ascii="Arial" w:cs="Arial" w:eastAsia="Arial" w:hAnsi="Arial"/>
+          <w:b/>
+          <w:bCs/>
+          <w:sz w:val="22"/>
+          <w:szCs w:val="22"/>
+        </w:rPr>
+        <w:t xml:space="preserve">Curva de facturación y demanda</w:t>
+      </w:r>
+      <w:r>
+        <w:rPr>
+          <w:rFonts w:ascii="Arial" w:cs="Arial" w:eastAsia="Arial" w:hAnsi="Arial"/>
+          <w:sz w:val="22"/>
+          <w:szCs w:val="22"/>
+        </w:rPr>
+        <w:t xml:space="preserve"> y tiempo medio de domicilio.</w:t>
+      </w:r>
+    </w:p>
+    <w:p>
+      <w:pPr>
+        <w:spacing w:after="60"/>
+      </w:pPr>
+    </w:p>
+    <w:p>
+      <w:pPr>
+        <w:spacing w:after="120" w:line="300"/>
+        <w:jc w:val="left"/>
+      </w:pPr>
+      <w:r>
+        <w:rPr>
+          <w:rFonts w:ascii="Arial" w:cs="Arial" w:eastAsia="Arial" w:hAnsi="Arial"/>
+          <w:b/>
+          <w:bCs/>
+          <w:sz w:val="22"/>
+          <w:szCs w:val="22"/>
+        </w:rPr>
+        <w:t xml:space="preserve">[Insertar captura: panel de indicadores]</w:t>
+      </w:r>
+    </w:p>
+    <w:p>
+      <w:pPr>
+        <w:pStyle w:val="Heading3"/>
+        <w:keepNext/>
+        <w:spacing w:after="120" w:before="280"/>
+        <w:jc w:val="left"/>
+      </w:pPr>
+      <w:r>
+        <w:rPr>
+          <w:rFonts w:ascii="Arial" w:cs="Arial" w:eastAsia="Arial" w:hAnsi="Arial"/>
+          <w:b/>
+          <w:bCs/>
+          <w:color w:val="3A2B32"/>
+          <w:sz w:val="26"/>
+          <w:szCs w:val="26"/>
+        </w:rPr>
+        <w:t xml:space="preserve">7.2 Informes y exportaciones</w:t>
+      </w:r>
+    </w:p>
+    <w:p>
+      <w:pPr>
+        <w:pStyle w:val="ListParagraph"/>
+        <w:numPr>
+          <w:ilvl w:val="0"/>
+          <w:numId w:val="3"/>
+        </w:numPr>
+        <w:spacing w:after="60"/>
+      </w:pPr>
+      <w:r>
+        <w:rPr>
+          <w:rFonts w:ascii="Arial" w:cs="Arial" w:eastAsia="Arial" w:hAnsi="Arial"/>
+          <w:b/>
+          <w:bCs/>
+          <w:sz w:val="22"/>
+          <w:szCs w:val="22"/>
+        </w:rPr>
+        <w:t xml:space="preserve">Facturas:</w:t>
+      </w:r>
+      <w:r>
+        <w:rPr>
+          <w:rFonts w:ascii="Arial" w:cs="Arial" w:eastAsia="Arial" w:hAnsi="Arial"/>
+          <w:sz w:val="22"/>
+          <w:szCs w:val="22"/>
+        </w:rPr>
+        <w:t xml:space="preserve"> filtre por fechas, cliente, cajero o estado y exporte el listado en </w:t>
+      </w:r>
+      <w:r>
+        <w:rPr>
+          <w:rFonts w:ascii="Arial" w:cs="Arial" w:eastAsia="Arial" w:hAnsi="Arial"/>
+          <w:b/>
+          <w:bCs/>
+          <w:sz w:val="22"/>
+          <w:szCs w:val="22"/>
+        </w:rPr>
+        <w:t xml:space="preserve">CSV</w:t>
+      </w:r>
+      <w:r>
+        <w:rPr>
+          <w:rFonts w:ascii="Arial" w:cs="Arial" w:eastAsia="Arial" w:hAnsi="Arial"/>
+          <w:sz w:val="22"/>
+          <w:szCs w:val="22"/>
+        </w:rPr>
+        <w:t xml:space="preserve"> (resumido o detallado).</w:t>
+      </w:r>
+    </w:p>
+    <w:p>
+      <w:pPr>
+        <w:pStyle w:val="ListParagraph"/>
+        <w:numPr>
+          <w:ilvl w:val="0"/>
+          <w:numId w:val="3"/>
+        </w:numPr>
+        <w:spacing w:after="60"/>
+      </w:pPr>
+      <w:r>
+        <w:rPr>
+          <w:rFonts w:ascii="Arial" w:cs="Arial" w:eastAsia="Arial" w:hAnsi="Arial"/>
+          <w:b/>
+          <w:bCs/>
+          <w:sz w:val="22"/>
+          <w:szCs w:val="22"/>
+        </w:rPr>
+        <w:t xml:space="preserve">Historial de turnos de caja:</w:t>
+      </w:r>
+      <w:r>
+        <w:rPr>
+          <w:rFonts w:ascii="Arial" w:cs="Arial" w:eastAsia="Arial" w:hAnsi="Arial"/>
+          <w:sz w:val="22"/>
+          <w:szCs w:val="22"/>
+        </w:rPr>
+        <w:t xml:space="preserve"> exportable a CSV.</w:t>
+      </w:r>
+    </w:p>
+    <w:p>
+      <w:pPr>
+        <w:pStyle w:val="ListParagraph"/>
+        <w:numPr>
+          <w:ilvl w:val="0"/>
+          <w:numId w:val="3"/>
+        </w:numPr>
+        <w:spacing w:after="60"/>
+      </w:pPr>
+      <w:r>
+        <w:rPr>
+          <w:rFonts w:ascii="Arial" w:cs="Arial" w:eastAsia="Arial" w:hAnsi="Arial"/>
+          <w:b/>
+          <w:bCs/>
+          <w:sz w:val="22"/>
+          <w:szCs w:val="22"/>
+        </w:rPr>
+        <w:t xml:space="preserve">Reservas:</w:t>
+      </w:r>
+      <w:r>
+        <w:rPr>
+          <w:rFonts w:ascii="Arial" w:cs="Arial" w:eastAsia="Arial" w:hAnsi="Arial"/>
+          <w:sz w:val="22"/>
+          <w:szCs w:val="22"/>
+        </w:rPr>
+        <w:t xml:space="preserve"> filtre por día, estado o búsqueda y exporte a CSV.</w:t>
+      </w:r>
+    </w:p>
+    <w:p>
+      <w:pPr>
+        <w:pStyle w:val="ListParagraph"/>
+        <w:numPr>
+          <w:ilvl w:val="0"/>
+          <w:numId w:val="3"/>
+        </w:numPr>
+        <w:spacing w:after="60"/>
+      </w:pPr>
+      <w:r>
+        <w:rPr>
+          <w:rFonts w:ascii="Arial" w:cs="Arial" w:eastAsia="Arial" w:hAnsi="Arial"/>
+          <w:b/>
+          <w:bCs/>
+          <w:sz w:val="22"/>
+          <w:szCs w:val="22"/>
+        </w:rPr>
+        <w:t xml:space="preserve">Auditoría:</w:t>
+      </w:r>
+      <w:r>
+        <w:rPr>
+          <w:rFonts w:ascii="Arial" w:cs="Arial" w:eastAsia="Arial" w:hAnsi="Arial"/>
+          <w:sz w:val="22"/>
+          <w:szCs w:val="22"/>
+        </w:rPr>
+        <w:t xml:space="preserve"> consulte quién hizo cada acción importante (fecha, usuario, módulo y detalle) y expórtela a CSV.</w:t>
+      </w:r>
+    </w:p>
+    <w:p>
+      <w:pPr>
+        <w:spacing w:after="60"/>
+      </w:pPr>
+    </w:p>
+    <w:p>
+      <w:pPr>
+        <w:spacing w:after="120" w:line="300"/>
+        <w:jc w:val="left"/>
+      </w:pPr>
+      <w:r>
+        <w:rPr>
+          <w:rFonts w:ascii="Arial" w:cs="Arial" w:eastAsia="Arial" w:hAnsi="Arial"/>
+          <w:b/>
+          <w:bCs/>
+          <w:sz w:val="22"/>
+          <w:szCs w:val="22"/>
+        </w:rPr>
+        <w:t xml:space="preserve">[Insertar captura: listado de facturas con filtros]</w:t>
+      </w:r>
+    </w:p>
+    <w:p>
+      <w:pPr>
+        <w:pStyle w:val="Heading3"/>
+        <w:keepNext/>
+        <w:spacing w:after="120" w:before="280"/>
+        <w:jc w:val="left"/>
+      </w:pPr>
+      <w:r>
+        <w:rPr>
+          <w:rFonts w:ascii="Arial" w:cs="Arial" w:eastAsia="Arial" w:hAnsi="Arial"/>
+          <w:b/>
+          <w:bCs/>
+          <w:color w:val="3A2B32"/>
+          <w:sz w:val="26"/>
+          <w:szCs w:val="26"/>
+        </w:rPr>
+        <w:t xml:space="preserve">7.3 Productos e inventario</w:t>
+      </w:r>
+    </w:p>
+    <w:p>
+      <w:pPr>
+        <w:pStyle w:val="ListParagraph"/>
+        <w:numPr>
+          <w:ilvl w:val="0"/>
+          <w:numId w:val="16"/>
+        </w:numPr>
+        <w:spacing w:after="60"/>
+      </w:pPr>
+      <w:r>
+        <w:rPr>
+          <w:rFonts w:ascii="Arial" w:cs="Arial" w:eastAsia="Arial" w:hAnsi="Arial"/>
+          <w:sz w:val="22"/>
+          <w:szCs w:val="22"/>
+        </w:rPr>
+        <w:t xml:space="preserve">Entre a </w:t>
+      </w:r>
+      <w:r>
+        <w:rPr>
+          <w:rFonts w:ascii="Arial" w:cs="Arial" w:eastAsia="Arial" w:hAnsi="Arial"/>
+          <w:b/>
+          <w:bCs/>
+          <w:sz w:val="22"/>
+          <w:szCs w:val="22"/>
+        </w:rPr>
+        <w:t xml:space="preserve">Productos</w:t>
+      </w:r>
+      <w:r>
+        <w:rPr>
+          <w:rFonts w:ascii="Arial" w:cs="Arial" w:eastAsia="Arial" w:hAnsi="Arial"/>
+          <w:sz w:val="22"/>
+          <w:szCs w:val="22"/>
+        </w:rPr>
+        <w:t xml:space="preserve">.</w:t>
+      </w:r>
+    </w:p>
+    <w:p>
+      <w:pPr>
+        <w:pStyle w:val="ListParagraph"/>
+        <w:numPr>
+          <w:ilvl w:val="0"/>
+          <w:numId w:val="16"/>
+        </w:numPr>
+        <w:spacing w:after="60"/>
+      </w:pPr>
+      <w:r>
+        <w:rPr>
+          <w:rFonts w:ascii="Arial" w:cs="Arial" w:eastAsia="Arial" w:hAnsi="Arial"/>
+          <w:sz w:val="22"/>
+          <w:szCs w:val="22"/>
+        </w:rPr>
+        <w:t xml:space="preserve">Pulse </w:t>
+      </w:r>
+      <w:r>
+        <w:rPr>
+          <w:rFonts w:ascii="Arial" w:cs="Arial" w:eastAsia="Arial" w:hAnsi="Arial"/>
+          <w:b/>
+          <w:bCs/>
+          <w:sz w:val="22"/>
+          <w:szCs w:val="22"/>
+        </w:rPr>
+        <w:t xml:space="preserve">Nuevo producto</w:t>
+      </w:r>
+      <w:r>
+        <w:rPr>
+          <w:rFonts w:ascii="Arial" w:cs="Arial" w:eastAsia="Arial" w:hAnsi="Arial"/>
+          <w:sz w:val="22"/>
+          <w:szCs w:val="22"/>
+        </w:rPr>
+        <w:t xml:space="preserve"> para registrar nombre, descripción, precio, existencias, categoría, ingredientes, alérgenos y si es vegetariano o libre de gluten.</w:t>
+      </w:r>
+    </w:p>
+    <w:p>
+      <w:pPr>
+        <w:pStyle w:val="ListParagraph"/>
+        <w:numPr>
+          <w:ilvl w:val="0"/>
+          <w:numId w:val="16"/>
+        </w:numPr>
+        <w:spacing w:after="60"/>
+      </w:pPr>
+      <w:r>
+        <w:rPr>
+          <w:rFonts w:ascii="Arial" w:cs="Arial" w:eastAsia="Arial" w:hAnsi="Arial"/>
+          <w:sz w:val="22"/>
+          <w:szCs w:val="22"/>
+        </w:rPr>
+        <w:t xml:space="preserve">Use </w:t>
+      </w:r>
+      <w:r>
+        <w:rPr>
+          <w:rFonts w:ascii="Arial" w:cs="Arial" w:eastAsia="Arial" w:hAnsi="Arial"/>
+          <w:b/>
+          <w:bCs/>
+          <w:sz w:val="22"/>
+          <w:szCs w:val="22"/>
+        </w:rPr>
+        <w:t xml:space="preserve">Editar</w:t>
+      </w:r>
+      <w:r>
+        <w:rPr>
+          <w:rFonts w:ascii="Arial" w:cs="Arial" w:eastAsia="Arial" w:hAnsi="Arial"/>
+          <w:sz w:val="22"/>
+          <w:szCs w:val="22"/>
+        </w:rPr>
+        <w:t xml:space="preserve"> para modificar datos o reponer el stock y </w:t>
+      </w:r>
+      <w:r>
+        <w:rPr>
+          <w:rFonts w:ascii="Arial" w:cs="Arial" w:eastAsia="Arial" w:hAnsi="Arial"/>
+          <w:b/>
+          <w:bCs/>
+          <w:sz w:val="22"/>
+          <w:szCs w:val="22"/>
+        </w:rPr>
+        <w:t xml:space="preserve">Desactivar</w:t>
+      </w:r>
+      <w:r>
+        <w:rPr>
+          <w:rFonts w:ascii="Arial" w:cs="Arial" w:eastAsia="Arial" w:hAnsi="Arial"/>
+          <w:sz w:val="22"/>
+          <w:szCs w:val="22"/>
+        </w:rPr>
+        <w:t xml:space="preserve"> para retirar un plato de la carta sin borrar su historial.</w:t>
+      </w:r>
+    </w:p>
+    <w:p>
+      <w:pPr>
+        <w:spacing w:after="60"/>
+      </w:pPr>
+    </w:p>
+    <w:p>
+      <w:pPr>
+        <w:pStyle w:val="Heading3"/>
+        <w:keepNext/>
+        <w:spacing w:after="120" w:before="280"/>
+        <w:jc w:val="left"/>
+      </w:pPr>
+      <w:r>
+        <w:rPr>
+          <w:rFonts w:ascii="Arial" w:cs="Arial" w:eastAsia="Arial" w:hAnsi="Arial"/>
+          <w:b/>
+          <w:bCs/>
+          <w:color w:val="3A2B32"/>
+          <w:sz w:val="26"/>
+          <w:szCs w:val="26"/>
+        </w:rPr>
+        <w:t xml:space="preserve">7.4 Proveedores</w:t>
+      </w:r>
+    </w:p>
+    <w:p>
+      <w:pPr>
+        <w:spacing w:after="120" w:line="300"/>
+        <w:jc w:val="left"/>
+      </w:pPr>
+      <w:r>
+        <w:rPr>
+          <w:rFonts w:ascii="Arial" w:cs="Arial" w:eastAsia="Arial" w:hAnsi="Arial"/>
+          <w:sz w:val="22"/>
+          <w:szCs w:val="22"/>
+        </w:rPr>
+        <w:t xml:space="preserve">En </w:t>
+      </w:r>
+      <w:r>
+        <w:rPr>
+          <w:rFonts w:ascii="Arial" w:cs="Arial" w:eastAsia="Arial" w:hAnsi="Arial"/>
+          <w:b/>
+          <w:bCs/>
+          <w:sz w:val="22"/>
+          <w:szCs w:val="22"/>
+        </w:rPr>
+        <w:t xml:space="preserve">Proveedores</w:t>
+      </w:r>
+      <w:r>
+        <w:rPr>
+          <w:rFonts w:ascii="Arial" w:cs="Arial" w:eastAsia="Arial" w:hAnsi="Arial"/>
+          <w:sz w:val="22"/>
+          <w:szCs w:val="22"/>
+        </w:rPr>
+        <w:t xml:space="preserve"> registre nombre, NIT, contacto, teléfono, correo, dirección y categoría; edite o desactive proveedores.</w:t>
+      </w:r>
+    </w:p>
+    <w:p>
+      <w:pPr>
+        <w:pStyle w:val="Heading3"/>
+        <w:keepNext/>
+        <w:spacing w:after="120" w:before="280"/>
+        <w:jc w:val="left"/>
+      </w:pPr>
+      <w:r>
+        <w:rPr>
+          <w:rFonts w:ascii="Arial" w:cs="Arial" w:eastAsia="Arial" w:hAnsi="Arial"/>
+          <w:b/>
+          <w:bCs/>
+          <w:color w:val="3A2B32"/>
+          <w:sz w:val="26"/>
+          <w:szCs w:val="26"/>
+        </w:rPr>
+        <w:t xml:space="preserve">7.5 Clientes</w:t>
+      </w:r>
+    </w:p>
+    <w:p>
+      <w:pPr>
+        <w:spacing w:after="120" w:line="300"/>
+        <w:jc w:val="left"/>
+      </w:pPr>
+      <w:r>
+        <w:rPr>
+          <w:rFonts w:ascii="Arial" w:cs="Arial" w:eastAsia="Arial" w:hAnsi="Arial"/>
+          <w:sz w:val="22"/>
+          <w:szCs w:val="22"/>
+        </w:rPr>
+        <w:t xml:space="preserve">En </w:t>
+      </w:r>
+      <w:r>
+        <w:rPr>
+          <w:rFonts w:ascii="Arial" w:cs="Arial" w:eastAsia="Arial" w:hAnsi="Arial"/>
+          <w:b/>
+          <w:bCs/>
+          <w:sz w:val="22"/>
+          <w:szCs w:val="22"/>
+        </w:rPr>
+        <w:t xml:space="preserve">Clientes</w:t>
+      </w:r>
+      <w:r>
+        <w:rPr>
+          <w:rFonts w:ascii="Arial" w:cs="Arial" w:eastAsia="Arial" w:hAnsi="Arial"/>
+          <w:sz w:val="22"/>
+          <w:szCs w:val="22"/>
+        </w:rPr>
+        <w:t xml:space="preserve"> consulte y edite los datos de los comensales registrados (documento, teléfono, correo, dirección, fecha de nacimiento).</w:t>
+      </w:r>
+    </w:p>
+    <w:p>
+      <w:pPr>
+        <w:pStyle w:val="Heading3"/>
+        <w:keepNext/>
+        <w:spacing w:after="120" w:before="280"/>
+        <w:jc w:val="left"/>
+      </w:pPr>
+      <w:r>
+        <w:rPr>
+          <w:rFonts w:ascii="Arial" w:cs="Arial" w:eastAsia="Arial" w:hAnsi="Arial"/>
+          <w:b/>
+          <w:bCs/>
+          <w:color w:val="3A2B32"/>
+          <w:sz w:val="26"/>
+          <w:szCs w:val="26"/>
+        </w:rPr>
+        <w:t xml:space="preserve">7.6 Cupones de descuento</w:t>
+      </w:r>
+    </w:p>
+    <w:p>
+      <w:pPr>
+        <w:pStyle w:val="ListParagraph"/>
+        <w:numPr>
+          <w:ilvl w:val="0"/>
+          <w:numId w:val="17"/>
+        </w:numPr>
+        <w:spacing w:after="60"/>
+      </w:pPr>
+      <w:r>
+        <w:rPr>
+          <w:rFonts w:ascii="Arial" w:cs="Arial" w:eastAsia="Arial" w:hAnsi="Arial"/>
+          <w:sz w:val="22"/>
+          <w:szCs w:val="22"/>
+        </w:rPr>
+        <w:t xml:space="preserve">Entre a </w:t>
+      </w:r>
+      <w:r>
+        <w:rPr>
+          <w:rFonts w:ascii="Arial" w:cs="Arial" w:eastAsia="Arial" w:hAnsi="Arial"/>
+          <w:b/>
+          <w:bCs/>
+          <w:sz w:val="22"/>
+          <w:szCs w:val="22"/>
+        </w:rPr>
+        <w:t xml:space="preserve">Cupones ➜ Nuevo</w:t>
+      </w:r>
+      <w:r>
+        <w:rPr>
+          <w:rFonts w:ascii="Arial" w:cs="Arial" w:eastAsia="Arial" w:hAnsi="Arial"/>
+          <w:sz w:val="22"/>
+          <w:szCs w:val="22"/>
+        </w:rPr>
+        <w:t xml:space="preserve">.</w:t>
+      </w:r>
+    </w:p>
+    <w:p>
+      <w:pPr>
+        <w:pStyle w:val="ListParagraph"/>
+        <w:numPr>
+          <w:ilvl w:val="0"/>
+          <w:numId w:val="17"/>
+        </w:numPr>
+        <w:spacing w:after="60"/>
+      </w:pPr>
+      <w:r>
+        <w:rPr>
+          <w:rFonts w:ascii="Arial" w:cs="Arial" w:eastAsia="Arial" w:hAnsi="Arial"/>
+          <w:sz w:val="22"/>
+          <w:szCs w:val="22"/>
+        </w:rPr>
+        <w:t xml:space="preserve">Defina el </w:t>
+      </w:r>
+      <w:r>
+        <w:rPr>
+          <w:rFonts w:ascii="Arial" w:cs="Arial" w:eastAsia="Arial" w:hAnsi="Arial"/>
+          <w:b/>
+          <w:bCs/>
+          <w:sz w:val="22"/>
+          <w:szCs w:val="22"/>
+        </w:rPr>
+        <w:t xml:space="preserve">código</w:t>
+      </w:r>
+      <w:r>
+        <w:rPr>
+          <w:rFonts w:ascii="Arial" w:cs="Arial" w:eastAsia="Arial" w:hAnsi="Arial"/>
+          <w:sz w:val="22"/>
+          <w:szCs w:val="22"/>
+        </w:rPr>
+        <w:t xml:space="preserve">, el tipo de descuento (porcentaje o valor fijo), el valor, el monto mínimo de compra, el tope máximo, la fecha de vencimiento y el número máximo de usos.</w:t>
+      </w:r>
+    </w:p>
+    <w:p>
+      <w:pPr>
+        <w:pStyle w:val="ListParagraph"/>
+        <w:numPr>
+          <w:ilvl w:val="0"/>
+          <w:numId w:val="17"/>
+        </w:numPr>
+        <w:spacing w:after="60"/>
+      </w:pPr>
+      <w:r>
+        <w:rPr>
+          <w:rFonts w:ascii="Arial" w:cs="Arial" w:eastAsia="Arial" w:hAnsi="Arial"/>
+          <w:sz w:val="22"/>
+          <w:szCs w:val="22"/>
+        </w:rPr>
+        <w:t xml:space="preserve">Active o desactive un cupón con </w:t>
+      </w:r>
+      <w:r>
+        <w:rPr>
+          <w:rFonts w:ascii="Arial" w:cs="Arial" w:eastAsia="Arial" w:hAnsi="Arial"/>
+          <w:b/>
+          <w:bCs/>
+          <w:sz w:val="22"/>
+          <w:szCs w:val="22"/>
+        </w:rPr>
+        <w:t xml:space="preserve">Activar/Desactivar</w:t>
+      </w:r>
+      <w:r>
+        <w:rPr>
+          <w:rFonts w:ascii="Arial" w:cs="Arial" w:eastAsia="Arial" w:hAnsi="Arial"/>
+          <w:sz w:val="22"/>
+          <w:szCs w:val="22"/>
+        </w:rPr>
+        <w:t xml:space="preserve">.</w:t>
+      </w:r>
+    </w:p>
+    <w:p>
+      <w:pPr>
+        <w:spacing w:after="60"/>
+      </w:pPr>
+    </w:p>
+    <w:p>
+      <w:pPr>
+        <w:pStyle w:val="Heading3"/>
+        <w:keepNext/>
+        <w:spacing w:after="120" w:before="280"/>
+        <w:jc w:val="left"/>
+      </w:pPr>
+      <w:r>
+        <w:rPr>
+          <w:rFonts w:ascii="Arial" w:cs="Arial" w:eastAsia="Arial" w:hAnsi="Arial"/>
+          <w:b/>
+          <w:bCs/>
+          <w:color w:val="3A2B32"/>
+          <w:sz w:val="26"/>
+          <w:szCs w:val="26"/>
+        </w:rPr>
+        <w:t xml:space="preserve">7.7 Personal (usuarios del sistema)</w:t>
+      </w:r>
+    </w:p>
+    <w:p>
+      <w:pPr>
+        <w:pStyle w:val="ListParagraph"/>
+        <w:numPr>
+          <w:ilvl w:val="0"/>
+          <w:numId w:val="18"/>
+        </w:numPr>
+        <w:spacing w:after="60"/>
+      </w:pPr>
+      <w:r>
+        <w:rPr>
+          <w:rFonts w:ascii="Arial" w:cs="Arial" w:eastAsia="Arial" w:hAnsi="Arial"/>
+          <w:sz w:val="22"/>
+          <w:szCs w:val="22"/>
+        </w:rPr>
+        <w:t xml:space="preserve">Entre a </w:t>
+      </w:r>
+      <w:r>
+        <w:rPr>
+          <w:rFonts w:ascii="Arial" w:cs="Arial" w:eastAsia="Arial" w:hAnsi="Arial"/>
+          <w:b/>
+          <w:bCs/>
+          <w:sz w:val="22"/>
+          <w:szCs w:val="22"/>
+        </w:rPr>
+        <w:t xml:space="preserve">Personal ➜ Crear</w:t>
+      </w:r>
+      <w:r>
+        <w:rPr>
+          <w:rFonts w:ascii="Arial" w:cs="Arial" w:eastAsia="Arial" w:hAnsi="Arial"/>
+          <w:sz w:val="22"/>
+          <w:szCs w:val="22"/>
+        </w:rPr>
+        <w:t xml:space="preserve">.</w:t>
+      </w:r>
+    </w:p>
+    <w:p>
+      <w:pPr>
+        <w:pStyle w:val="ListParagraph"/>
+        <w:numPr>
+          <w:ilvl w:val="0"/>
+          <w:numId w:val="18"/>
+        </w:numPr>
+        <w:spacing w:after="60"/>
+      </w:pPr>
+      <w:r>
+        <w:rPr>
+          <w:rFonts w:ascii="Arial" w:cs="Arial" w:eastAsia="Arial" w:hAnsi="Arial"/>
+          <w:sz w:val="22"/>
+          <w:szCs w:val="22"/>
+        </w:rPr>
+        <w:t xml:space="preserve">Escriba el usuario, el correo y elija el </w:t>
+      </w:r>
+      <w:r>
+        <w:rPr>
+          <w:rFonts w:ascii="Arial" w:cs="Arial" w:eastAsia="Arial" w:hAnsi="Arial"/>
+          <w:b/>
+          <w:bCs/>
+          <w:sz w:val="22"/>
+          <w:szCs w:val="22"/>
+        </w:rPr>
+        <w:t xml:space="preserve">rol</w:t>
+      </w:r>
+      <w:r>
+        <w:rPr>
+          <w:rFonts w:ascii="Arial" w:cs="Arial" w:eastAsia="Arial" w:hAnsi="Arial"/>
+          <w:sz w:val="22"/>
+          <w:szCs w:val="22"/>
+        </w:rPr>
+        <w:t xml:space="preserve"> (Mesero, Cocinero, Cajero, Domiciliario o Administrador).</w:t>
+      </w:r>
+    </w:p>
+    <w:p>
+      <w:pPr>
+        <w:pStyle w:val="ListParagraph"/>
+        <w:numPr>
+          <w:ilvl w:val="0"/>
+          <w:numId w:val="18"/>
+        </w:numPr>
+        <w:spacing w:after="60"/>
+      </w:pPr>
+      <w:r>
+        <w:rPr>
+          <w:rFonts w:ascii="Arial" w:cs="Arial" w:eastAsia="Arial" w:hAnsi="Arial"/>
+          <w:sz w:val="22"/>
+          <w:szCs w:val="22"/>
+        </w:rPr>
+        <w:t xml:space="preserve">El sistema genera una contraseña temporal; el empleado deberá cambiarla en su primer ingreso.</w:t>
+      </w:r>
+    </w:p>
+    <w:p>
+      <w:pPr>
+        <w:pStyle w:val="ListParagraph"/>
+        <w:numPr>
+          <w:ilvl w:val="0"/>
+          <w:numId w:val="18"/>
+        </w:numPr>
+        <w:spacing w:after="60"/>
+      </w:pPr>
+      <w:r>
+        <w:rPr>
+          <w:rFonts w:ascii="Arial" w:cs="Arial" w:eastAsia="Arial" w:hAnsi="Arial"/>
+          <w:sz w:val="22"/>
+          <w:szCs w:val="22"/>
+        </w:rPr>
+        <w:t xml:space="preserve">Desde la misma pantalla puede </w:t>
+      </w:r>
+      <w:r>
+        <w:rPr>
+          <w:rFonts w:ascii="Arial" w:cs="Arial" w:eastAsia="Arial" w:hAnsi="Arial"/>
+          <w:b/>
+          <w:bCs/>
+          <w:sz w:val="22"/>
+          <w:szCs w:val="22"/>
+        </w:rPr>
+        <w:t xml:space="preserve">cambiar el rol</w:t>
+      </w:r>
+      <w:r>
+        <w:rPr>
+          <w:rFonts w:ascii="Arial" w:cs="Arial" w:eastAsia="Arial" w:hAnsi="Arial"/>
+          <w:sz w:val="22"/>
+          <w:szCs w:val="22"/>
+        </w:rPr>
+        <w:t xml:space="preserve">, </w:t>
+      </w:r>
+      <w:r>
+        <w:rPr>
+          <w:rFonts w:ascii="Arial" w:cs="Arial" w:eastAsia="Arial" w:hAnsi="Arial"/>
+          <w:b/>
+          <w:bCs/>
+          <w:sz w:val="22"/>
+          <w:szCs w:val="22"/>
+        </w:rPr>
+        <w:t xml:space="preserve">activar o desactivar</w:t>
+      </w:r>
+      <w:r>
+        <w:rPr>
+          <w:rFonts w:ascii="Arial" w:cs="Arial" w:eastAsia="Arial" w:hAnsi="Arial"/>
+          <w:sz w:val="22"/>
+          <w:szCs w:val="22"/>
+        </w:rPr>
+        <w:t xml:space="preserve"> una cuenta y </w:t>
+      </w:r>
+      <w:r>
+        <w:rPr>
+          <w:rFonts w:ascii="Arial" w:cs="Arial" w:eastAsia="Arial" w:hAnsi="Arial"/>
+          <w:b/>
+          <w:bCs/>
+          <w:sz w:val="22"/>
+          <w:szCs w:val="22"/>
+        </w:rPr>
+        <w:t xml:space="preserve">restablecer la contraseña</w:t>
+      </w:r>
+      <w:r>
+        <w:rPr>
+          <w:rFonts w:ascii="Arial" w:cs="Arial" w:eastAsia="Arial" w:hAnsi="Arial"/>
+          <w:sz w:val="22"/>
+          <w:szCs w:val="22"/>
+        </w:rPr>
+        <w:t xml:space="preserve">.</w:t>
+      </w:r>
+    </w:p>
+    <w:p>
+      <w:pPr>
+        <w:spacing w:after="60"/>
+      </w:pPr>
+    </w:p>
+    <w:p>
+      <w:pPr>
+        <w:pStyle w:val="Heading3"/>
+        <w:keepNext/>
+        <w:spacing w:after="120" w:before="280"/>
+        <w:jc w:val="left"/>
+      </w:pPr>
+      <w:r>
+        <w:rPr>
+          <w:rFonts w:ascii="Arial" w:cs="Arial" w:eastAsia="Arial" w:hAnsi="Arial"/>
+          <w:b/>
+          <w:bCs/>
+          <w:color w:val="3A2B32"/>
+          <w:sz w:val="26"/>
+          <w:szCs w:val="26"/>
+        </w:rPr>
+        <w:t xml:space="preserve">7.8 Reservas</w:t>
+      </w:r>
+    </w:p>
+    <w:p>
+      <w:pPr>
+        <w:spacing w:after="120" w:line="300"/>
+        <w:jc w:val="left"/>
+      </w:pPr>
+      <w:r>
+        <w:rPr>
+          <w:rFonts w:ascii="Arial" w:cs="Arial" w:eastAsia="Arial" w:hAnsi="Arial"/>
+          <w:sz w:val="22"/>
+          <w:szCs w:val="22"/>
+        </w:rPr>
+        <w:t xml:space="preserve">En </w:t>
+      </w:r>
+      <w:r>
+        <w:rPr>
+          <w:rFonts w:ascii="Arial" w:cs="Arial" w:eastAsia="Arial" w:hAnsi="Arial"/>
+          <w:b/>
+          <w:bCs/>
+          <w:sz w:val="22"/>
+          <w:szCs w:val="22"/>
+        </w:rPr>
+        <w:t xml:space="preserve">Reservas (administración)</w:t>
+      </w:r>
+      <w:r>
+        <w:rPr>
+          <w:rFonts w:ascii="Arial" w:cs="Arial" w:eastAsia="Arial" w:hAnsi="Arial"/>
+          <w:sz w:val="22"/>
+          <w:szCs w:val="22"/>
+        </w:rPr>
+        <w:t xml:space="preserve"> vea las reservas por día, cambie su estado (confirmada, completada, cancelada) y consulte los avisos recientes.</w:t>
+      </w:r>
+    </w:p>
+    <w:p>
+      <w:pPr>
+        <w:pStyle w:val="Heading3"/>
+        <w:keepNext/>
+        <w:spacing w:after="120" w:before="280"/>
+        <w:jc w:val="left"/>
+      </w:pPr>
+      <w:r>
+        <w:rPr>
+          <w:rFonts w:ascii="Arial" w:cs="Arial" w:eastAsia="Arial" w:hAnsi="Arial"/>
+          <w:b/>
+          <w:bCs/>
+          <w:color w:val="3A2B32"/>
+          <w:sz w:val="26"/>
+          <w:szCs w:val="26"/>
+        </w:rPr>
+        <w:t xml:space="preserve">7.9 Domicilios</w:t>
+      </w:r>
+    </w:p>
+    <w:p>
+      <w:pPr>
+        <w:spacing w:after="120" w:line="300"/>
+        <w:jc w:val="left"/>
+      </w:pPr>
+      <w:r>
+        <w:rPr>
+          <w:rFonts w:ascii="Arial" w:cs="Arial" w:eastAsia="Arial" w:hAnsi="Arial"/>
+          <w:sz w:val="22"/>
+          <w:szCs w:val="22"/>
+        </w:rPr>
+        <w:t xml:space="preserve">En </w:t>
+      </w:r>
+      <w:r>
+        <w:rPr>
+          <w:rFonts w:ascii="Arial" w:cs="Arial" w:eastAsia="Arial" w:hAnsi="Arial"/>
+          <w:b/>
+          <w:bCs/>
+          <w:sz w:val="22"/>
+          <w:szCs w:val="22"/>
+        </w:rPr>
+        <w:t xml:space="preserve">Domicilios</w:t>
+      </w:r>
+      <w:r>
+        <w:rPr>
+          <w:rFonts w:ascii="Arial" w:cs="Arial" w:eastAsia="Arial" w:hAnsi="Arial"/>
+          <w:sz w:val="22"/>
+          <w:szCs w:val="22"/>
+        </w:rPr>
+        <w:t xml:space="preserve"> el administrador ajusta el valor del envío de un pedido, asigna el repartidor y actualiza el estado del domicilio.</w:t>
+      </w:r>
+    </w:p>
+    <w:p>
+      <w:pPr>
+        <w:pStyle w:val="Heading3"/>
+        <w:keepNext/>
+        <w:spacing w:after="120" w:before="280"/>
+        <w:jc w:val="left"/>
+      </w:pPr>
+      <w:r>
+        <w:rPr>
+          <w:rFonts w:ascii="Arial" w:cs="Arial" w:eastAsia="Arial" w:hAnsi="Arial"/>
+          <w:b/>
+          <w:bCs/>
+          <w:color w:val="3A2B32"/>
+          <w:sz w:val="26"/>
+          <w:szCs w:val="26"/>
+        </w:rPr>
+        <w:t xml:space="preserve">7.10 Recetario y reporte de repartos</w:t>
+      </w:r>
+    </w:p>
+    <w:p>
+      <w:pPr>
+        <w:pStyle w:val="ListParagraph"/>
+        <w:numPr>
+          <w:ilvl w:val="0"/>
+          <w:numId w:val="3"/>
+        </w:numPr>
+        <w:spacing w:after="60"/>
+      </w:pPr>
+      <w:r>
+        <w:rPr>
+          <w:rFonts w:ascii="Arial" w:cs="Arial" w:eastAsia="Arial" w:hAnsi="Arial"/>
+          <w:b/>
+          <w:bCs/>
+          <w:sz w:val="22"/>
+          <w:szCs w:val="22"/>
+        </w:rPr>
+        <w:t xml:space="preserve">Recetario Carta:</w:t>
+      </w:r>
+      <w:r>
+        <w:rPr>
+          <w:rFonts w:ascii="Arial" w:cs="Arial" w:eastAsia="Arial" w:hAnsi="Arial"/>
+          <w:sz w:val="22"/>
+          <w:szCs w:val="22"/>
+        </w:rPr>
+        <w:t xml:space="preserve"> fichas técnicas de los platos (ingredientes y preparación), para estandarizar la calidad en cocina.</w:t>
+      </w:r>
+    </w:p>
+    <w:p>
+      <w:pPr>
+        <w:pStyle w:val="ListParagraph"/>
+        <w:numPr>
+          <w:ilvl w:val="0"/>
+          <w:numId w:val="3"/>
+        </w:numPr>
+        <w:spacing w:after="60"/>
+      </w:pPr>
+      <w:r>
+        <w:rPr>
+          <w:rFonts w:ascii="Arial" w:cs="Arial" w:eastAsia="Arial" w:hAnsi="Arial"/>
+          <w:b/>
+          <w:bCs/>
+          <w:sz w:val="22"/>
+          <w:szCs w:val="22"/>
+        </w:rPr>
+        <w:t xml:space="preserve">Reporte de repartos:</w:t>
+      </w:r>
+      <w:r>
+        <w:rPr>
+          <w:rFonts w:ascii="Arial" w:cs="Arial" w:eastAsia="Arial" w:hAnsi="Arial"/>
+          <w:sz w:val="22"/>
+          <w:szCs w:val="22"/>
+        </w:rPr>
+        <w:t xml:space="preserve"> entregas de los domiciliarios por rango de fechas.</w:t>
+      </w:r>
+    </w:p>
+    <w:p>
+      <w:pPr>
+        <w:spacing w:after="60"/>
+      </w:pPr>
+    </w:p>
+    <w:p>
+      <w:pPr>
+        <w:pStyle w:val="Heading3"/>
+        <w:keepNext/>
+        <w:spacing w:after="120" w:before="280"/>
+        <w:jc w:val="left"/>
+      </w:pPr>
+      <w:r>
+        <w:rPr>
+          <w:rFonts w:ascii="Arial" w:cs="Arial" w:eastAsia="Arial" w:hAnsi="Arial"/>
+          <w:b/>
+          <w:bCs/>
+          <w:color w:val="3A2B32"/>
+          <w:sz w:val="26"/>
+          <w:szCs w:val="26"/>
+        </w:rPr>
+        <w:t xml:space="preserve">7.11 Reseñas</w:t>
+      </w:r>
+    </w:p>
+    <w:p>
+      <w:pPr>
+        <w:spacing w:after="120" w:line="300"/>
+        <w:jc w:val="left"/>
+      </w:pPr>
+      <w:r>
+        <w:rPr>
+          <w:rFonts w:ascii="Arial" w:cs="Arial" w:eastAsia="Arial" w:hAnsi="Arial"/>
+          <w:sz w:val="22"/>
+          <w:szCs w:val="22"/>
+        </w:rPr>
+        <w:t xml:space="preserve">En </w:t>
+      </w:r>
+      <w:r>
+        <w:rPr>
+          <w:rFonts w:ascii="Arial" w:cs="Arial" w:eastAsia="Arial" w:hAnsi="Arial"/>
+          <w:b/>
+          <w:bCs/>
+          <w:sz w:val="22"/>
+          <w:szCs w:val="22"/>
+        </w:rPr>
+        <w:t xml:space="preserve">Reseñas</w:t>
+      </w:r>
+      <w:r>
+        <w:rPr>
+          <w:rFonts w:ascii="Arial" w:cs="Arial" w:eastAsia="Arial" w:hAnsi="Arial"/>
+          <w:sz w:val="22"/>
+          <w:szCs w:val="22"/>
+        </w:rPr>
+        <w:t xml:space="preserve"> apruebe, oculte o elimine los comentarios de los clientes antes de que se publiquen en la página de inicio.</w:t>
+      </w:r>
+    </w:p>
+    <w:p>
+      <w:pPr>
+        <w:pBdr>
+          <w:bottom w:val="single" w:color="D9CBB8" w:sz="6" w:space="1"/>
+        </w:pBdr>
+        <w:spacing w:after="160" w:before="120"/>
+      </w:pPr>
+    </w:p>
+    <w:p>
+      <w:pPr>
+        <w:pStyle w:val="Heading2"/>
+        <w:keepNext/>
+        <w:pageBreakBefore/>
+        <w:spacing w:after="120" w:before="280"/>
+        <w:jc w:val="left"/>
+      </w:pPr>
+      <w:r>
+        <w:rPr>
+          <w:rFonts w:ascii="Arial" w:cs="Arial" w:eastAsia="Arial" w:hAnsi="Arial"/>
+          <w:b/>
+          <w:bCs/>
+          <w:color w:val="6B1E2E"/>
+          <w:sz w:val="30"/>
+          <w:szCs w:val="30"/>
+        </w:rPr>
+        <w:t xml:space="preserve">8. Rol Domiciliario (complemento)</w:t>
+      </w:r>
+    </w:p>
+    <w:p>
+      <w:pPr>
+        <w:spacing w:after="120" w:line="300"/>
+        <w:jc w:val="left"/>
+      </w:pPr>
+      <w:r>
+        <w:rPr>
+          <w:rFonts w:ascii="Arial" w:cs="Arial" w:eastAsia="Arial" w:hAnsi="Arial"/>
+          <w:b/>
+          <w:bCs/>
+          <w:sz w:val="22"/>
+          <w:szCs w:val="22"/>
+        </w:rPr>
+        <w:t xml:space="preserve">Inicio:</w:t>
+      </w:r>
+      <w:r>
+        <w:rPr>
+          <w:rFonts w:ascii="Arial" w:cs="Arial" w:eastAsia="Arial" w:hAnsi="Arial"/>
+          <w:sz w:val="22"/>
+          <w:szCs w:val="22"/>
+        </w:rPr>
+        <w:t xml:space="preserve"> </w:t>
+      </w:r>
+      <w:r>
+        <w:rPr>
+          <w:rFonts w:ascii="Arial" w:cs="Arial" w:eastAsia="Arial" w:hAnsi="Arial"/>
+          <w:b/>
+          <w:bCs/>
+          <w:sz w:val="22"/>
+          <w:szCs w:val="22"/>
+        </w:rPr>
         <w:t xml:space="preserve">Repartos</w:t>
       </w:r>
       <w:r>
@@ -7127,7 +7196,7 @@
           <w:sz w:val="22"/>
           <w:szCs w:val="22"/>
         </w:rPr>
-        <w:t xml:space="preserve">Consulte el </w:t>
+        <w:t xml:space="preserve">El </w:t>
       </w:r>
       <w:r>
         <w:rPr>
@@ -7145,7 +7214,7 @@
           <w:sz w:val="22"/>
           <w:szCs w:val="22"/>
         </w:rPr>
-        <w:t xml:space="preserve"> por rango de fechas para ver sus entregas.</w:t>
+        <w:t xml:space="preserve"> por rango de fechas lo consulta el administrador.</w:t>
       </w:r>
     </w:p>
     <w:p>

</xml_diff>